<commit_message>
Move all figures to a ~35% right column in the Investment Risks template
Co-Authored-By: Claude Opus 5.5 <noreply@anthropic.com>
Claude-Session: https://claude.ai/code/session_0188QZHBkA8n5QL7BtmFakQg
</commit_message>
<xml_diff>
--- a/informe/Investment_Risks_template.docx
+++ b/informe/Investment_Risks_template.docx
@@ -65,14 +65,14 @@
         </w:tblBorders>
       </w:tblPr>
       <w:tblGrid>
-        <w:gridCol w:w="6050"/>
+        <w:gridCol w:w="6950"/>
         <w:gridCol w:w="250"/>
-        <w:gridCol w:w="4700"/>
+        <w:gridCol w:w="3800"/>
       </w:tblGrid>
       <w:tr>
         <w:tc>
           <w:tcPr>
-            <w:tcW w:type="dxa" w:w="6050"/>
+            <w:tcW w:type="dxa" w:w="6950"/>
             <w:tcBorders>
               <w:top w:val="none" w:color="FFFFFF" w:sz="0"/>
               <w:left w:val="none" w:color="FFFFFF" w:sz="0"/>
@@ -87,208 +87,6 @@
             </w:tcMar>
             <w:vAlign w:val="top"/>
           </w:tcPr>
-          <w:tbl>
-            <w:tblPr>
-              <w:tblW w:type="dxa" w:w="6050"/>
-              <w:tblBorders>
-                <w:top w:val="none" w:color="FFFFFF" w:sz="0"/>
-                <w:left w:val="none" w:color="FFFFFF" w:sz="0"/>
-                <w:bottom w:val="none" w:color="FFFFFF" w:sz="0"/>
-                <w:right w:val="none" w:color="FFFFFF" w:sz="0"/>
-                <w:insideH w:val="none" w:color="FFFFFF" w:sz="0"/>
-                <w:insideV w:val="none" w:color="FFFFFF" w:sz="0"/>
-              </w:tblBorders>
-            </w:tblPr>
-            <w:tblGrid>
-              <w:gridCol w:w="2700"/>
-              <w:gridCol w:w="3350"/>
-            </w:tblGrid>
-            <w:tr>
-              <w:tc>
-                <w:tcPr>
-                  <w:tcW w:type="dxa" w:w="2700"/>
-                  <w:tcBorders>
-                    <w:top w:val="none" w:color="FFFFFF" w:sz="0"/>
-                    <w:left w:val="none" w:color="FFFFFF" w:sz="0"/>
-                    <w:bottom w:val="none" w:color="FFFFFF" w:sz="0"/>
-                    <w:right w:val="none" w:color="FFFFFF" w:sz="0"/>
-                  </w:tcBorders>
-                  <w:tcMar>
-                    <w:top w:type="dxa" w:w="0"/>
-                    <w:left w:type="dxa" w:w="0"/>
-                    <w:bottom w:type="dxa" w:w="0"/>
-                    <w:right w:type="dxa" w:w="0"/>
-                  </w:tcMar>
-                </w:tcPr>
-                <w:p>
-                  <w:pPr>
-                    <w:spacing w:after="20" w:before="60"/>
-                  </w:pPr>
-                  <w:r>
-                    <w:rPr>
-                      <w:rFonts w:ascii="Arial" w:cs="Arial" w:eastAsia="Arial" w:hAnsi="Arial"/>
-                      <w:b/>
-                      <w:bCs/>
-                      <w:color w:val="14284B"/>
-                      <w:sz w:val="14"/>
-                      <w:szCs w:val="14"/>
-                    </w:rPr>
-                    <w:t xml:space="preserve">Figure 1: </w:t>
-                  </w:r>
-                  <w:r>
-                    <w:rPr>
-                      <w:rFonts w:ascii="Arial" w:cs="Arial" w:eastAsia="Arial" w:hAnsi="Arial"/>
-                      <w:color w:val="14284B"/>
-                      <w:sz w:val="14"/>
-                      <w:szCs w:val="14"/>
-                    </w:rPr>
-                    <w:t xml:space="preserve">Risk matrix</w:t>
-                  </w:r>
-                </w:p>
-                <w:p>
-                  <w:pPr>
-                    <w:spacing w:after="0"/>
-                    <w:jc w:val="center"/>
-                  </w:pPr>
-                  <w:r>
-                    <w:drawing>
-                      <wp:inline distT="0" distB="0" distL="0" distR="0">
-                        <wp:extent cx="1714500" cy="1928813"/>
-                        <wp:effectExtent t="0" r="0" b="0" l="0"/>
-                        <wp:docPr id="1" name="matriz_riesgo.png" descr="matriz_riesgo.png" title="matriz_riesgo.png"/>
-                        <wp:cNvGraphicFramePr>
-                          <a:graphicFrameLocks xmlns:a="http://schemas.openxmlformats.org/drawingml/2006/main" noChangeAspect="1"/>
-                        </wp:cNvGraphicFramePr>
-                        <a:graphic xmlns:a="http://schemas.openxmlformats.org/drawingml/2006/main">
-                          <a:graphicData uri="http://schemas.openxmlformats.org/drawingml/2006/picture">
-                            <pic:pic xmlns:pic="http://schemas.openxmlformats.org/drawingml/2006/picture">
-                              <pic:nvPicPr>
-                                <pic:cNvPr id="0" name="" descr=""/>
-                                <pic:cNvPicPr>
-                                  <a:picLocks noChangeAspect="1" noChangeArrowheads="1"/>
-                                </pic:cNvPicPr>
-                              </pic:nvPicPr>
-                              <pic:blipFill>
-                                <a:blip r:embed="rId7" cstate="none"/>
-                                <a:srcRect/>
-                                <a:stretch>
-                                  <a:fillRect/>
-                                </a:stretch>
-                              </pic:blipFill>
-                              <pic:spPr bwMode="auto">
-                                <a:xfrm>
-                                  <a:off x="0" y="0"/>
-                                  <a:ext cx="1714500" cy="1928813"/>
-                                </a:xfrm>
-                                <a:prstGeom prst="rect">
-                                  <a:avLst/>
-                                </a:prstGeom>
-                              </pic:spPr>
-                            </pic:pic>
-                          </a:graphicData>
-                        </a:graphic>
-                      </wp:inline>
-                    </w:drawing>
-                  </w:r>
-                </w:p>
-              </w:tc>
-              <w:tc>
-                <w:tcPr>
-                  <w:tcW w:type="dxa" w:w="3350"/>
-                  <w:tcBorders>
-                    <w:top w:val="none" w:color="FFFFFF" w:sz="0"/>
-                    <w:left w:val="none" w:color="FFFFFF" w:sz="0"/>
-                    <w:bottom w:val="none" w:color="FFFFFF" w:sz="0"/>
-                    <w:right w:val="none" w:color="FFFFFF" w:sz="0"/>
-                  </w:tcBorders>
-                  <w:tcMar>
-                    <w:top w:type="dxa" w:w="0"/>
-                    <w:left w:type="dxa" w:w="200"/>
-                    <w:bottom w:type="dxa" w:w="0"/>
-                    <w:right w:type="dxa" w:w="0"/>
-                  </w:tcMar>
-                </w:tcPr>
-                <w:p>
-                  <w:pPr>
-                    <w:spacing w:after="40" w:before="60"/>
-                  </w:pPr>
-                  <w:r>
-                    <w:rPr>
-                      <w:rFonts w:ascii="Arial" w:cs="Arial" w:eastAsia="Arial" w:hAnsi="Arial"/>
-                      <w:b/>
-                      <w:bCs/>
-                      <w:color w:val="14284B"/>
-                      <w:sz w:val="16"/>
-                      <w:szCs w:val="16"/>
-                    </w:rPr>
-                    <w:t xml:space="preserve">Risk assessment</w:t>
-                  </w:r>
-                </w:p>
-                <w:p>
-                  <w:pPr>
-                    <w:spacing w:after="40" w:before="0" w:line="228"/>
-                    <w:jc w:val="left"/>
-                  </w:pPr>
-                  <w:sdt>
-                    <w:sdtPr>
-                      <w:rPr>
-                        <w:rFonts w:ascii="Arial" w:hAnsi="Arial" w:cs="Arial"/>
-                        <w:color w:val="1A1A1A"/>
-                        <w:sz w:val="16"/>
-                        <w:szCs w:val="16"/>
-                      </w:rPr>
-                      <w:id w:val="1001"/>
-                      <w:showingPlcHdr/>
-                    </w:sdtPr>
-                    <w:sdtContent>
-                      <w:r>
-                        <w:rPr>
-                          <w:rFonts w:ascii="Arial" w:cs="Arial" w:eastAsia="Arial" w:hAnsi="Arial"/>
-                          <w:i/>
-                          <w:iCs/>
-                          <w:color w:val="808081"/>
-                          <w:sz w:val="16"/>
-                          <w:szCs w:val="16"/>
-                        </w:rPr>
-                        <w:t xml:space="preserve">[Explain how likelihood and impact were scored (1–5) and which risks fall in the high-risk zone.]</w:t>
-                      </w:r>
-                    </w:sdtContent>
-                  </w:sdt>
-                </w:p>
-                <w:p>
-                  <w:pPr>
-                    <w:spacing w:after="40" w:before="0" w:line="228"/>
-                    <w:jc w:val="left"/>
-                  </w:pPr>
-                  <w:sdt>
-                    <w:sdtPr>
-                      <w:rPr>
-                        <w:rFonts w:ascii="Arial" w:hAnsi="Arial" w:cs="Arial"/>
-                        <w:color w:val="1A1A1A"/>
-                        <w:sz w:val="16"/>
-                        <w:szCs w:val="16"/>
-                      </w:rPr>
-                      <w:id w:val="1002"/>
-                      <w:showingPlcHdr/>
-                    </w:sdtPr>
-                    <w:sdtContent>
-                      <w:r>
-                        <w:rPr>
-                          <w:rFonts w:ascii="Arial" w:cs="Arial" w:eastAsia="Arial" w:hAnsi="Arial"/>
-                          <w:i/>
-                          <w:iCs/>
-                          <w:color w:val="808081"/>
-                          <w:sz w:val="16"/>
-                          <w:szCs w:val="16"/>
-                        </w:rPr>
-                        <w:t xml:space="preserve">[Key takeaway: the risk that matters most for the investment thesis and the recommendation.]</w:t>
-                      </w:r>
-                    </w:sdtContent>
-                  </w:sdt>
-                </w:p>
-              </w:tc>
-            </w:tr>
-          </w:tbl>
           <w:p>
             <w:pPr>
               <w:pBdr>
@@ -305,57 +103,12 @@
                 <w:sz w:val="16"/>
                 <w:szCs w:val="16"/>
               </w:rPr>
-              <w:t xml:space="preserve">OPERATIONAL RISKS</w:t>
-            </w:r>
-          </w:p>
-          <w:p>
-            <w:pPr>
-              <w:spacing w:after="10" w:before="30"/>
-            </w:pPr>
-            <w:r>
-              <w:rPr>
-                <w:rFonts w:ascii="Arial" w:cs="Arial" w:eastAsia="Arial" w:hAnsi="Arial"/>
-                <w:b/>
-                <w:bCs/>
-                <w:color w:val="E9004B"/>
-                <w:sz w:val="16"/>
-                <w:szCs w:val="16"/>
-              </w:rPr>
-              <w:t xml:space="preserve">OR1: </w:t>
-            </w:r>
-            <w:sdt>
-              <w:sdtPr>
-                <w:rPr>
-                  <w:rFonts w:ascii="Arial" w:hAnsi="Arial" w:cs="Arial"/>
-                  <w:b/>
-                  <w:bCs/>
-                  <w:color w:val="1A1A1A"/>
-                  <w:sz w:val="16"/>
-                  <w:szCs w:val="16"/>
-                </w:rPr>
-                <w:id w:val="1003"/>
-                <w:showingPlcHdr/>
-              </w:sdtPr>
-              <w:sdtContent>
-                <w:r>
-                  <w:rPr>
-                    <w:rFonts w:ascii="Arial" w:cs="Arial" w:eastAsia="Arial" w:hAnsi="Arial"/>
-                    <w:b/>
-                    <w:bCs/>
-                    <w:i/>
-                    <w:iCs/>
-                    <w:color w:val="808081"/>
-                    <w:sz w:val="16"/>
-                    <w:szCs w:val="16"/>
-                  </w:rPr>
-                  <w:t xml:space="preserve">[Risk title, e.g. EBITDA margin compression]</w:t>
-                </w:r>
-              </w:sdtContent>
-            </w:sdt>
-          </w:p>
-          <w:p>
-            <w:pPr>
-              <w:spacing w:after="10" w:before="0" w:line="228"/>
+              <w:t xml:space="preserve">RISK ASSESSMENT</w:t>
+            </w:r>
+          </w:p>
+          <w:p>
+            <w:pPr>
+              <w:spacing w:after="40" w:before="0" w:line="228"/>
               <w:jc w:val="both"/>
             </w:pPr>
             <w:sdt>
@@ -366,298 +119,20 @@
                   <w:sz w:val="16"/>
                   <w:szCs w:val="16"/>
                 </w:rPr>
-                <w:id w:val="1004"/>
-                <w:showingPlcHdr/>
-              </w:sdtPr>
-              <w:sdtContent>
-                <w:r>
-                  <w:rPr>
-                    <w:rFonts w:ascii="Arial" w:cs="Arial" w:eastAsia="Arial" w:hAnsi="Arial"/>
-                    <w:i/>
-                    <w:iCs/>
-                    <w:color w:val="808081"/>
-                    <w:sz w:val="16"/>
-                    <w:szCs w:val="16"/>
-                  </w:rPr>
-                  <w:t xml:space="preserve">[Describe the risk: what could happen, how likely it is, and its impact on revenue, EBITDA or value per share; reference Figures 1–4 where relevant.]</w:t>
-                </w:r>
-              </w:sdtContent>
-            </w:sdt>
-          </w:p>
-          <w:p>
-            <w:pPr>
-              <w:spacing w:after="30" w:before="0" w:line="228"/>
-              <w:jc w:val="both"/>
-            </w:pPr>
-            <w:r>
-              <w:rPr>
-                <w:rFonts w:ascii="Arial" w:cs="Arial" w:eastAsia="Arial" w:hAnsi="Arial"/>
-                <w:b/>
-                <w:bCs/>
-                <w:color w:val="14284B"/>
-                <w:sz w:val="16"/>
-                <w:szCs w:val="16"/>
-              </w:rPr>
-              <w:t xml:space="preserve">Mitigants: </w:t>
-            </w:r>
-            <w:sdt>
-              <w:sdtPr>
-                <w:rPr>
-                  <w:rFonts w:ascii="Arial" w:hAnsi="Arial" w:cs="Arial"/>
-                  <w:color w:val="1A1A1A"/>
-                  <w:sz w:val="16"/>
-                  <w:szCs w:val="16"/>
-                </w:rPr>
-                <w:id w:val="1005"/>
-                <w:showingPlcHdr/>
-              </w:sdtPr>
-              <w:sdtContent>
-                <w:r>
-                  <w:rPr>
-                    <w:rFonts w:ascii="Arial" w:cs="Arial" w:eastAsia="Arial" w:hAnsi="Arial"/>
-                    <w:i/>
-                    <w:iCs/>
-                    <w:color w:val="808081"/>
-                    <w:sz w:val="16"/>
-                    <w:szCs w:val="16"/>
-                  </w:rPr>
-                  <w:t xml:space="preserve">[How the company or the thesis offsets this risk.]</w:t>
-                </w:r>
-              </w:sdtContent>
-            </w:sdt>
-          </w:p>
-          <w:p>
-            <w:pPr>
-              <w:spacing w:after="10" w:before="30"/>
-            </w:pPr>
-            <w:r>
-              <w:rPr>
-                <w:rFonts w:ascii="Arial" w:cs="Arial" w:eastAsia="Arial" w:hAnsi="Arial"/>
-                <w:b/>
-                <w:bCs/>
-                <w:color w:val="E9004B"/>
-                <w:sz w:val="16"/>
-                <w:szCs w:val="16"/>
-              </w:rPr>
-              <w:t xml:space="preserve">OR2: </w:t>
-            </w:r>
-            <w:sdt>
-              <w:sdtPr>
-                <w:rPr>
-                  <w:rFonts w:ascii="Arial" w:hAnsi="Arial" w:cs="Arial"/>
-                  <w:b/>
-                  <w:bCs/>
-                  <w:color w:val="1A1A1A"/>
-                  <w:sz w:val="16"/>
-                  <w:szCs w:val="16"/>
-                </w:rPr>
-                <w:id w:val="1006"/>
-                <w:showingPlcHdr/>
-              </w:sdtPr>
-              <w:sdtContent>
-                <w:r>
-                  <w:rPr>
-                    <w:rFonts w:ascii="Arial" w:cs="Arial" w:eastAsia="Arial" w:hAnsi="Arial"/>
-                    <w:b/>
-                    <w:bCs/>
-                    <w:i/>
-                    <w:iCs/>
-                    <w:color w:val="808081"/>
-                    <w:sz w:val="16"/>
-                    <w:szCs w:val="16"/>
-                  </w:rPr>
-                  <w:t xml:space="preserve">[Risk title, e.g. slowdown in same-store rent growth]</w:t>
-                </w:r>
-              </w:sdtContent>
-            </w:sdt>
-          </w:p>
-          <w:p>
-            <w:pPr>
-              <w:spacing w:after="10" w:before="0" w:line="228"/>
-              <w:jc w:val="both"/>
-            </w:pPr>
-            <w:sdt>
-              <w:sdtPr>
-                <w:rPr>
-                  <w:rFonts w:ascii="Arial" w:hAnsi="Arial" w:cs="Arial"/>
-                  <w:color w:val="1A1A1A"/>
-                  <w:sz w:val="16"/>
-                  <w:szCs w:val="16"/>
-                </w:rPr>
-                <w:id w:val="1007"/>
-                <w:showingPlcHdr/>
-              </w:sdtPr>
-              <w:sdtContent>
-                <w:r>
-                  <w:rPr>
-                    <w:rFonts w:ascii="Arial" w:cs="Arial" w:eastAsia="Arial" w:hAnsi="Arial"/>
-                    <w:i/>
-                    <w:iCs/>
-                    <w:color w:val="808081"/>
-                    <w:sz w:val="16"/>
-                    <w:szCs w:val="16"/>
-                  </w:rPr>
-                  <w:t xml:space="preserve">[Describe the risk: what could happen, how likely it is, and its impact on revenue, EBITDA or value per share; reference Figures 1–4 where relevant.]</w:t>
-                </w:r>
-              </w:sdtContent>
-            </w:sdt>
-          </w:p>
-          <w:p>
-            <w:pPr>
-              <w:spacing w:after="30" w:before="0" w:line="228"/>
-              <w:jc w:val="both"/>
-            </w:pPr>
-            <w:r>
-              <w:rPr>
-                <w:rFonts w:ascii="Arial" w:cs="Arial" w:eastAsia="Arial" w:hAnsi="Arial"/>
-                <w:b/>
-                <w:bCs/>
-                <w:color w:val="14284B"/>
-                <w:sz w:val="16"/>
-                <w:szCs w:val="16"/>
-              </w:rPr>
-              <w:t xml:space="preserve">Mitigants: </w:t>
-            </w:r>
-            <w:sdt>
-              <w:sdtPr>
-                <w:rPr>
-                  <w:rFonts w:ascii="Arial" w:hAnsi="Arial" w:cs="Arial"/>
-                  <w:color w:val="1A1A1A"/>
-                  <w:sz w:val="16"/>
-                  <w:szCs w:val="16"/>
-                </w:rPr>
-                <w:id w:val="1008"/>
-                <w:showingPlcHdr/>
-              </w:sdtPr>
-              <w:sdtContent>
-                <w:r>
-                  <w:rPr>
-                    <w:rFonts w:ascii="Arial" w:cs="Arial" w:eastAsia="Arial" w:hAnsi="Arial"/>
-                    <w:i/>
-                    <w:iCs/>
-                    <w:color w:val="808081"/>
-                    <w:sz w:val="16"/>
-                    <w:szCs w:val="16"/>
-                  </w:rPr>
-                  <w:t xml:space="preserve">[How the company or the thesis offsets this risk.]</w:t>
-                </w:r>
-              </w:sdtContent>
-            </w:sdt>
-          </w:p>
-          <w:p>
-            <w:pPr>
-              <w:spacing w:after="10" w:before="30"/>
-            </w:pPr>
-            <w:r>
-              <w:rPr>
-                <w:rFonts w:ascii="Arial" w:cs="Arial" w:eastAsia="Arial" w:hAnsi="Arial"/>
-                <w:b/>
-                <w:bCs/>
-                <w:color w:val="E9004B"/>
-                <w:sz w:val="16"/>
-                <w:szCs w:val="16"/>
-              </w:rPr>
-              <w:t xml:space="preserve">OR3: </w:t>
-            </w:r>
-            <w:sdt>
-              <w:sdtPr>
-                <w:rPr>
-                  <w:rFonts w:ascii="Arial" w:hAnsi="Arial" w:cs="Arial"/>
-                  <w:b/>
-                  <w:bCs/>
-                  <w:color w:val="1A1A1A"/>
-                  <w:sz w:val="16"/>
-                  <w:szCs w:val="16"/>
-                </w:rPr>
-                <w:id w:val="1009"/>
-                <w:showingPlcHdr/>
-              </w:sdtPr>
-              <w:sdtContent>
-                <w:r>
-                  <w:rPr>
-                    <w:rFonts w:ascii="Arial" w:cs="Arial" w:eastAsia="Arial" w:hAnsi="Arial"/>
-                    <w:b/>
-                    <w:bCs/>
-                    <w:i/>
-                    <w:iCs/>
-                    <w:color w:val="808081"/>
-                    <w:sz w:val="16"/>
-                    <w:szCs w:val="16"/>
-                  </w:rPr>
-                  <w:t xml:space="preserve">[Risk title, e.g. higher maintenance capex]</w:t>
-                </w:r>
-              </w:sdtContent>
-            </w:sdt>
-          </w:p>
-          <w:p>
-            <w:pPr>
-              <w:spacing w:after="10" w:before="0" w:line="228"/>
-              <w:jc w:val="both"/>
-            </w:pPr>
-            <w:sdt>
-              <w:sdtPr>
-                <w:rPr>
-                  <w:rFonts w:ascii="Arial" w:hAnsi="Arial" w:cs="Arial"/>
-                  <w:color w:val="1A1A1A"/>
-                  <w:sz w:val="16"/>
-                  <w:szCs w:val="16"/>
-                </w:rPr>
-                <w:id w:val="1010"/>
-                <w:showingPlcHdr/>
-              </w:sdtPr>
-              <w:sdtContent>
-                <w:r>
-                  <w:rPr>
-                    <w:rFonts w:ascii="Arial" w:cs="Arial" w:eastAsia="Arial" w:hAnsi="Arial"/>
-                    <w:i/>
-                    <w:iCs/>
-                    <w:color w:val="808081"/>
-                    <w:sz w:val="16"/>
-                    <w:szCs w:val="16"/>
-                  </w:rPr>
-                  <w:t xml:space="preserve">[Describe the risk: what could happen, how likely it is, and its impact on revenue, EBITDA or value per share; reference Figures 1–4 where relevant.]</w:t>
-                </w:r>
-              </w:sdtContent>
-            </w:sdt>
-          </w:p>
-          <w:p>
-            <w:pPr>
-              <w:spacing w:after="30" w:before="0" w:line="228"/>
-              <w:jc w:val="both"/>
-            </w:pPr>
-            <w:r>
-              <w:rPr>
-                <w:rFonts w:ascii="Arial" w:cs="Arial" w:eastAsia="Arial" w:hAnsi="Arial"/>
-                <w:b/>
-                <w:bCs/>
-                <w:color w:val="14284B"/>
-                <w:sz w:val="16"/>
-                <w:szCs w:val="16"/>
-              </w:rPr>
-              <w:t xml:space="preserve">Mitigants: </w:t>
-            </w:r>
-            <w:sdt>
-              <w:sdtPr>
-                <w:rPr>
-                  <w:rFonts w:ascii="Arial" w:hAnsi="Arial" w:cs="Arial"/>
-                  <w:color w:val="1A1A1A"/>
-                  <w:sz w:val="16"/>
-                  <w:szCs w:val="16"/>
-                </w:rPr>
-                <w:id w:val="1011"/>
-                <w:showingPlcHdr/>
-              </w:sdtPr>
-              <w:sdtContent>
-                <w:r>
-                  <w:rPr>
-                    <w:rFonts w:ascii="Arial" w:cs="Arial" w:eastAsia="Arial" w:hAnsi="Arial"/>
-                    <w:i/>
-                    <w:iCs/>
-                    <w:color w:val="808081"/>
-                    <w:sz w:val="16"/>
-                    <w:szCs w:val="16"/>
-                  </w:rPr>
-                  <w:t xml:space="preserve">[How the company or the thesis offsets this risk.]</w:t>
+                <w:id w:val="1001"/>
+                <w:showingPlcHdr/>
+              </w:sdtPr>
+              <w:sdtContent>
+                <w:r>
+                  <w:rPr>
+                    <w:rFonts w:ascii="Arial" w:cs="Arial" w:eastAsia="Arial" w:hAnsi="Arial"/>
+                    <w:i/>
+                    <w:iCs/>
+                    <w:color w:val="808081"/>
+                    <w:sz w:val="16"/>
+                    <w:szCs w:val="16"/>
+                  </w:rPr>
+                  <w:t xml:space="preserve">[Explain how likelihood and impact were scored (1–5) in Figure 1 and which risks fall in the high-risk zone.]</w:t>
                 </w:r>
               </w:sdtContent>
             </w:sdt>
@@ -678,7 +153,7 @@
                 <w:sz w:val="16"/>
                 <w:szCs w:val="16"/>
               </w:rPr>
-              <w:t xml:space="preserve">FINANCIAL RISKS</w:t>
+              <w:t xml:space="preserve">OPERATIONAL RISKS</w:t>
             </w:r>
           </w:p>
           <w:p>
@@ -694,7 +169,7 @@
                 <w:sz w:val="16"/>
                 <w:szCs w:val="16"/>
               </w:rPr>
-              <w:t xml:space="preserve">FR1: </w:t>
+              <w:t xml:space="preserve">OR1: </w:t>
             </w:r>
             <w:sdt>
               <w:sdtPr>
@@ -706,7 +181,7 @@
                   <w:sz w:val="16"/>
                   <w:szCs w:val="16"/>
                 </w:rPr>
-                <w:id w:val="1012"/>
+                <w:id w:val="1002"/>
                 <w:showingPlcHdr/>
               </w:sdtPr>
               <w:sdtContent>
@@ -721,7 +196,7 @@
                     <w:sz w:val="16"/>
                     <w:szCs w:val="16"/>
                   </w:rPr>
-                  <w:t xml:space="preserve">[Risk title, e.g. revaluation of UF-indexed debt]</w:t>
+                  <w:t xml:space="preserve">[Risk title, e.g. EBITDA margin compression]</w:t>
                 </w:r>
               </w:sdtContent>
             </w:sdt>
@@ -739,7 +214,7 @@
                   <w:sz w:val="16"/>
                   <w:szCs w:val="16"/>
                 </w:rPr>
-                <w:id w:val="1013"/>
+                <w:id w:val="1003"/>
                 <w:showingPlcHdr/>
               </w:sdtPr>
               <w:sdtContent>
@@ -781,7 +256,7 @@
                   <w:sz w:val="16"/>
                   <w:szCs w:val="16"/>
                 </w:rPr>
-                <w:id w:val="1014"/>
+                <w:id w:val="1004"/>
                 <w:showingPlcHdr/>
               </w:sdtPr>
               <w:sdtContent>
@@ -812,7 +287,7 @@
                 <w:sz w:val="16"/>
                 <w:szCs w:val="16"/>
               </w:rPr>
-              <w:t xml:space="preserve">FR2: </w:t>
+              <w:t xml:space="preserve">OR2: </w:t>
             </w:r>
             <w:sdt>
               <w:sdtPr>
@@ -824,7 +299,7 @@
                   <w:sz w:val="16"/>
                   <w:szCs w:val="16"/>
                 </w:rPr>
-                <w:id w:val="1015"/>
+                <w:id w:val="1005"/>
                 <w:showingPlcHdr/>
               </w:sdtPr>
               <w:sdtContent>
@@ -839,7 +314,7 @@
                     <w:sz w:val="16"/>
                     <w:szCs w:val="16"/>
                   </w:rPr>
-                  <w:t xml:space="preserve">[Risk title, e.g. higher cost of capital]</w:t>
+                  <w:t xml:space="preserve">[Risk title, e.g. slowdown in same-store rent growth]</w:t>
                 </w:r>
               </w:sdtContent>
             </w:sdt>
@@ -857,7 +332,7 @@
                   <w:sz w:val="16"/>
                   <w:szCs w:val="16"/>
                 </w:rPr>
-                <w:id w:val="1016"/>
+                <w:id w:val="1006"/>
                 <w:showingPlcHdr/>
               </w:sdtPr>
               <w:sdtContent>
@@ -899,7 +374,125 @@
                   <w:sz w:val="16"/>
                   <w:szCs w:val="16"/>
                 </w:rPr>
-                <w:id w:val="1017"/>
+                <w:id w:val="1007"/>
+                <w:showingPlcHdr/>
+              </w:sdtPr>
+              <w:sdtContent>
+                <w:r>
+                  <w:rPr>
+                    <w:rFonts w:ascii="Arial" w:cs="Arial" w:eastAsia="Arial" w:hAnsi="Arial"/>
+                    <w:i/>
+                    <w:iCs/>
+                    <w:color w:val="808081"/>
+                    <w:sz w:val="16"/>
+                    <w:szCs w:val="16"/>
+                  </w:rPr>
+                  <w:t xml:space="preserve">[How the company or the thesis offsets this risk.]</w:t>
+                </w:r>
+              </w:sdtContent>
+            </w:sdt>
+          </w:p>
+          <w:p>
+            <w:pPr>
+              <w:spacing w:after="10" w:before="30"/>
+            </w:pPr>
+            <w:r>
+              <w:rPr>
+                <w:rFonts w:ascii="Arial" w:cs="Arial" w:eastAsia="Arial" w:hAnsi="Arial"/>
+                <w:b/>
+                <w:bCs/>
+                <w:color w:val="E9004B"/>
+                <w:sz w:val="16"/>
+                <w:szCs w:val="16"/>
+              </w:rPr>
+              <w:t xml:space="preserve">OR3: </w:t>
+            </w:r>
+            <w:sdt>
+              <w:sdtPr>
+                <w:rPr>
+                  <w:rFonts w:ascii="Arial" w:hAnsi="Arial" w:cs="Arial"/>
+                  <w:b/>
+                  <w:bCs/>
+                  <w:color w:val="1A1A1A"/>
+                  <w:sz w:val="16"/>
+                  <w:szCs w:val="16"/>
+                </w:rPr>
+                <w:id w:val="1008"/>
+                <w:showingPlcHdr/>
+              </w:sdtPr>
+              <w:sdtContent>
+                <w:r>
+                  <w:rPr>
+                    <w:rFonts w:ascii="Arial" w:cs="Arial" w:eastAsia="Arial" w:hAnsi="Arial"/>
+                    <w:b/>
+                    <w:bCs/>
+                    <w:i/>
+                    <w:iCs/>
+                    <w:color w:val="808081"/>
+                    <w:sz w:val="16"/>
+                    <w:szCs w:val="16"/>
+                  </w:rPr>
+                  <w:t xml:space="preserve">[Risk title, e.g. higher maintenance capex]</w:t>
+                </w:r>
+              </w:sdtContent>
+            </w:sdt>
+          </w:p>
+          <w:p>
+            <w:pPr>
+              <w:spacing w:after="10" w:before="0" w:line="228"/>
+              <w:jc w:val="both"/>
+            </w:pPr>
+            <w:sdt>
+              <w:sdtPr>
+                <w:rPr>
+                  <w:rFonts w:ascii="Arial" w:hAnsi="Arial" w:cs="Arial"/>
+                  <w:color w:val="1A1A1A"/>
+                  <w:sz w:val="16"/>
+                  <w:szCs w:val="16"/>
+                </w:rPr>
+                <w:id w:val="1009"/>
+                <w:showingPlcHdr/>
+              </w:sdtPr>
+              <w:sdtContent>
+                <w:r>
+                  <w:rPr>
+                    <w:rFonts w:ascii="Arial" w:cs="Arial" w:eastAsia="Arial" w:hAnsi="Arial"/>
+                    <w:i/>
+                    <w:iCs/>
+                    <w:color w:val="808081"/>
+                    <w:sz w:val="16"/>
+                    <w:szCs w:val="16"/>
+                  </w:rPr>
+                  <w:t xml:space="preserve">[Describe the risk: what could happen, how likely it is, and its impact on revenue, EBITDA or value per share; reference Figures 1–4 where relevant.]</w:t>
+                </w:r>
+              </w:sdtContent>
+            </w:sdt>
+          </w:p>
+          <w:p>
+            <w:pPr>
+              <w:spacing w:after="30" w:before="0" w:line="228"/>
+              <w:jc w:val="both"/>
+            </w:pPr>
+            <w:r>
+              <w:rPr>
+                <w:rFonts w:ascii="Arial" w:cs="Arial" w:eastAsia="Arial" w:hAnsi="Arial"/>
+                <w:b/>
+                <w:bCs/>
+                <w:color w:val="14284B"/>
+                <w:sz w:val="16"/>
+                <w:szCs w:val="16"/>
+              </w:rPr>
+              <w:t xml:space="preserve">Mitigants: </w:t>
+            </w:r>
+            <w:sdt>
+              <w:sdtPr>
+                <w:rPr>
+                  <w:rFonts w:ascii="Arial" w:hAnsi="Arial" w:cs="Arial"/>
+                  <w:color w:val="1A1A1A"/>
+                  <w:sz w:val="16"/>
+                  <w:szCs w:val="16"/>
+                </w:rPr>
+                <w:id w:val="1010"/>
                 <w:showingPlcHdr/>
               </w:sdtPr>
               <w:sdtContent>
@@ -933,7 +526,7 @@
                 <w:sz w:val="16"/>
                 <w:szCs w:val="16"/>
               </w:rPr>
-              <w:t xml:space="preserve">MARKET &amp; MACROECONOMIC RISKS</w:t>
+              <w:t xml:space="preserve">FINANCIAL RISKS</w:t>
             </w:r>
           </w:p>
           <w:p>
@@ -949,7 +542,7 @@
                 <w:sz w:val="16"/>
                 <w:szCs w:val="16"/>
               </w:rPr>
-              <w:t xml:space="preserve">MR1: </w:t>
+              <w:t xml:space="preserve">FR1: </w:t>
             </w:r>
             <w:sdt>
               <w:sdtPr>
@@ -961,7 +554,7 @@
                   <w:sz w:val="16"/>
                   <w:szCs w:val="16"/>
                 </w:rPr>
-                <w:id w:val="1018"/>
+                <w:id w:val="1011"/>
                 <w:showingPlcHdr/>
               </w:sdtPr>
               <w:sdtContent>
@@ -976,7 +569,7 @@
                     <w:sz w:val="16"/>
                     <w:szCs w:val="16"/>
                   </w:rPr>
-                  <w:t xml:space="preserve">[Risk title, e.g. FX exposure in Peru and Colombia]</w:t>
+                  <w:t xml:space="preserve">[Risk title, e.g. revaluation of UF-indexed debt]</w:t>
                 </w:r>
               </w:sdtContent>
             </w:sdt>
@@ -994,7 +587,7 @@
                   <w:sz w:val="16"/>
                   <w:szCs w:val="16"/>
                 </w:rPr>
-                <w:id w:val="1019"/>
+                <w:id w:val="1012"/>
                 <w:showingPlcHdr/>
               </w:sdtPr>
               <w:sdtContent>
@@ -1036,7 +629,125 @@
                   <w:sz w:val="16"/>
                   <w:szCs w:val="16"/>
                 </w:rPr>
-                <w:id w:val="1020"/>
+                <w:id w:val="1013"/>
+                <w:showingPlcHdr/>
+              </w:sdtPr>
+              <w:sdtContent>
+                <w:r>
+                  <w:rPr>
+                    <w:rFonts w:ascii="Arial" w:cs="Arial" w:eastAsia="Arial" w:hAnsi="Arial"/>
+                    <w:i/>
+                    <w:iCs/>
+                    <w:color w:val="808081"/>
+                    <w:sz w:val="16"/>
+                    <w:szCs w:val="16"/>
+                  </w:rPr>
+                  <w:t xml:space="preserve">[How the company or the thesis offsets this risk.]</w:t>
+                </w:r>
+              </w:sdtContent>
+            </w:sdt>
+          </w:p>
+          <w:p>
+            <w:pPr>
+              <w:spacing w:after="10" w:before="30"/>
+            </w:pPr>
+            <w:r>
+              <w:rPr>
+                <w:rFonts w:ascii="Arial" w:cs="Arial" w:eastAsia="Arial" w:hAnsi="Arial"/>
+                <w:b/>
+                <w:bCs/>
+                <w:color w:val="E9004B"/>
+                <w:sz w:val="16"/>
+                <w:szCs w:val="16"/>
+              </w:rPr>
+              <w:t xml:space="preserve">FR2: </w:t>
+            </w:r>
+            <w:sdt>
+              <w:sdtPr>
+                <w:rPr>
+                  <w:rFonts w:ascii="Arial" w:hAnsi="Arial" w:cs="Arial"/>
+                  <w:b/>
+                  <w:bCs/>
+                  <w:color w:val="1A1A1A"/>
+                  <w:sz w:val="16"/>
+                  <w:szCs w:val="16"/>
+                </w:rPr>
+                <w:id w:val="1014"/>
+                <w:showingPlcHdr/>
+              </w:sdtPr>
+              <w:sdtContent>
+                <w:r>
+                  <w:rPr>
+                    <w:rFonts w:ascii="Arial" w:cs="Arial" w:eastAsia="Arial" w:hAnsi="Arial"/>
+                    <w:b/>
+                    <w:bCs/>
+                    <w:i/>
+                    <w:iCs/>
+                    <w:color w:val="808081"/>
+                    <w:sz w:val="16"/>
+                    <w:szCs w:val="16"/>
+                  </w:rPr>
+                  <w:t xml:space="preserve">[Risk title, e.g. higher cost of capital]</w:t>
+                </w:r>
+              </w:sdtContent>
+            </w:sdt>
+          </w:p>
+          <w:p>
+            <w:pPr>
+              <w:spacing w:after="10" w:before="0" w:line="228"/>
+              <w:jc w:val="both"/>
+            </w:pPr>
+            <w:sdt>
+              <w:sdtPr>
+                <w:rPr>
+                  <w:rFonts w:ascii="Arial" w:hAnsi="Arial" w:cs="Arial"/>
+                  <w:color w:val="1A1A1A"/>
+                  <w:sz w:val="16"/>
+                  <w:szCs w:val="16"/>
+                </w:rPr>
+                <w:id w:val="1015"/>
+                <w:showingPlcHdr/>
+              </w:sdtPr>
+              <w:sdtContent>
+                <w:r>
+                  <w:rPr>
+                    <w:rFonts w:ascii="Arial" w:cs="Arial" w:eastAsia="Arial" w:hAnsi="Arial"/>
+                    <w:i/>
+                    <w:iCs/>
+                    <w:color w:val="808081"/>
+                    <w:sz w:val="16"/>
+                    <w:szCs w:val="16"/>
+                  </w:rPr>
+                  <w:t xml:space="preserve">[Describe the risk: what could happen, how likely it is, and its impact on revenue, EBITDA or value per share; reference Figures 1–4 where relevant.]</w:t>
+                </w:r>
+              </w:sdtContent>
+            </w:sdt>
+          </w:p>
+          <w:p>
+            <w:pPr>
+              <w:spacing w:after="30" w:before="0" w:line="228"/>
+              <w:jc w:val="both"/>
+            </w:pPr>
+            <w:r>
+              <w:rPr>
+                <w:rFonts w:ascii="Arial" w:cs="Arial" w:eastAsia="Arial" w:hAnsi="Arial"/>
+                <w:b/>
+                <w:bCs/>
+                <w:color w:val="14284B"/>
+                <w:sz w:val="16"/>
+                <w:szCs w:val="16"/>
+              </w:rPr>
+              <w:t xml:space="preserve">Mitigants: </w:t>
+            </w:r>
+            <w:sdt>
+              <w:sdtPr>
+                <w:rPr>
+                  <w:rFonts w:ascii="Arial" w:hAnsi="Arial" w:cs="Arial"/>
+                  <w:color w:val="1A1A1A"/>
+                  <w:sz w:val="16"/>
+                  <w:szCs w:val="16"/>
+                </w:rPr>
+                <w:id w:val="1016"/>
                 <w:showingPlcHdr/>
               </w:sdtPr>
               <w:sdtContent>
@@ -1070,7 +781,7 @@
                 <w:sz w:val="16"/>
                 <w:szCs w:val="16"/>
               </w:rPr>
-              <w:t xml:space="preserve">REGULATORY &amp; ESG RISKS</w:t>
+              <w:t xml:space="preserve">MARKET &amp; MACROECONOMIC RISKS</w:t>
             </w:r>
           </w:p>
           <w:p>
@@ -1086,7 +797,7 @@
                 <w:sz w:val="16"/>
                 <w:szCs w:val="16"/>
               </w:rPr>
-              <w:t xml:space="preserve">RR1: </w:t>
+              <w:t xml:space="preserve">MR1: </w:t>
             </w:r>
             <w:sdt>
               <w:sdtPr>
@@ -1098,7 +809,7 @@
                   <w:sz w:val="16"/>
                   <w:szCs w:val="16"/>
                 </w:rPr>
-                <w:id w:val="1021"/>
+                <w:id w:val="1017"/>
                 <w:showingPlcHdr/>
               </w:sdtPr>
               <w:sdtContent>
@@ -1113,7 +824,7 @@
                     <w:sz w:val="16"/>
                     <w:szCs w:val="16"/>
                   </w:rPr>
-                  <w:t xml:space="preserve">[Risk title, e.g. related-party transactions]</w:t>
+                  <w:t xml:space="preserve">[Risk title, e.g. FX exposure in Peru and Colombia]</w:t>
                 </w:r>
               </w:sdtContent>
             </w:sdt>
@@ -1131,7 +842,7 @@
                   <w:sz w:val="16"/>
                   <w:szCs w:val="16"/>
                 </w:rPr>
-                <w:id w:val="1022"/>
+                <w:id w:val="1018"/>
                 <w:showingPlcHdr/>
               </w:sdtPr>
               <w:sdtContent>
@@ -1173,6 +884,193 @@
                   <w:sz w:val="16"/>
                   <w:szCs w:val="16"/>
                 </w:rPr>
+                <w:id w:val="1019"/>
+                <w:showingPlcHdr/>
+              </w:sdtPr>
+              <w:sdtContent>
+                <w:r>
+                  <w:rPr>
+                    <w:rFonts w:ascii="Arial" w:cs="Arial" w:eastAsia="Arial" w:hAnsi="Arial"/>
+                    <w:i/>
+                    <w:iCs/>
+                    <w:color w:val="808081"/>
+                    <w:sz w:val="16"/>
+                    <w:szCs w:val="16"/>
+                  </w:rPr>
+                  <w:t xml:space="preserve">[How the company or the thesis offsets this risk.]</w:t>
+                </w:r>
+              </w:sdtContent>
+            </w:sdt>
+          </w:p>
+          <w:p>
+            <w:pPr>
+              <w:pBdr>
+                <w:bottom w:val="single" w:color="E9004B" w:sz="8" w:space="1"/>
+              </w:pBdr>
+              <w:spacing w:after="50" w:before="100"/>
+            </w:pPr>
+            <w:r>
+              <w:rPr>
+                <w:rFonts w:ascii="Arial" w:cs="Arial" w:eastAsia="Arial" w:hAnsi="Arial"/>
+                <w:b/>
+                <w:bCs/>
+                <w:color w:val="14284B"/>
+                <w:sz w:val="16"/>
+                <w:szCs w:val="16"/>
+              </w:rPr>
+              <w:t xml:space="preserve">REGULATORY &amp; ESG RISKS</w:t>
+            </w:r>
+          </w:p>
+          <w:p>
+            <w:pPr>
+              <w:spacing w:after="10" w:before="30"/>
+            </w:pPr>
+            <w:r>
+              <w:rPr>
+                <w:rFonts w:ascii="Arial" w:cs="Arial" w:eastAsia="Arial" w:hAnsi="Arial"/>
+                <w:b/>
+                <w:bCs/>
+                <w:color w:val="E9004B"/>
+                <w:sz w:val="16"/>
+                <w:szCs w:val="16"/>
+              </w:rPr>
+              <w:t xml:space="preserve">RR1: </w:t>
+            </w:r>
+            <w:sdt>
+              <w:sdtPr>
+                <w:rPr>
+                  <w:rFonts w:ascii="Arial" w:hAnsi="Arial" w:cs="Arial"/>
+                  <w:b/>
+                  <w:bCs/>
+                  <w:color w:val="1A1A1A"/>
+                  <w:sz w:val="16"/>
+                  <w:szCs w:val="16"/>
+                </w:rPr>
+                <w:id w:val="1020"/>
+                <w:showingPlcHdr/>
+              </w:sdtPr>
+              <w:sdtContent>
+                <w:r>
+                  <w:rPr>
+                    <w:rFonts w:ascii="Arial" w:cs="Arial" w:eastAsia="Arial" w:hAnsi="Arial"/>
+                    <w:b/>
+                    <w:bCs/>
+                    <w:i/>
+                    <w:iCs/>
+                    <w:color w:val="808081"/>
+                    <w:sz w:val="16"/>
+                    <w:szCs w:val="16"/>
+                  </w:rPr>
+                  <w:t xml:space="preserve">[Risk title, e.g. related-party transactions]</w:t>
+                </w:r>
+              </w:sdtContent>
+            </w:sdt>
+          </w:p>
+          <w:p>
+            <w:pPr>
+              <w:spacing w:after="10" w:before="0" w:line="228"/>
+              <w:jc w:val="both"/>
+            </w:pPr>
+            <w:sdt>
+              <w:sdtPr>
+                <w:rPr>
+                  <w:rFonts w:ascii="Arial" w:hAnsi="Arial" w:cs="Arial"/>
+                  <w:color w:val="1A1A1A"/>
+                  <w:sz w:val="16"/>
+                  <w:szCs w:val="16"/>
+                </w:rPr>
+                <w:id w:val="1021"/>
+                <w:showingPlcHdr/>
+              </w:sdtPr>
+              <w:sdtContent>
+                <w:r>
+                  <w:rPr>
+                    <w:rFonts w:ascii="Arial" w:cs="Arial" w:eastAsia="Arial" w:hAnsi="Arial"/>
+                    <w:i/>
+                    <w:iCs/>
+                    <w:color w:val="808081"/>
+                    <w:sz w:val="16"/>
+                    <w:szCs w:val="16"/>
+                  </w:rPr>
+                  <w:t xml:space="preserve">[Describe the risk: what could happen, how likely it is, and its impact on revenue, EBITDA or value per share; reference Figures 1–4 where relevant.]</w:t>
+                </w:r>
+              </w:sdtContent>
+            </w:sdt>
+          </w:p>
+          <w:p>
+            <w:pPr>
+              <w:spacing w:after="30" w:before="0" w:line="228"/>
+              <w:jc w:val="both"/>
+            </w:pPr>
+            <w:r>
+              <w:rPr>
+                <w:rFonts w:ascii="Arial" w:cs="Arial" w:eastAsia="Arial" w:hAnsi="Arial"/>
+                <w:b/>
+                <w:bCs/>
+                <w:color w:val="14284B"/>
+                <w:sz w:val="16"/>
+                <w:szCs w:val="16"/>
+              </w:rPr>
+              <w:t xml:space="preserve">Mitigants: </w:t>
+            </w:r>
+            <w:sdt>
+              <w:sdtPr>
+                <w:rPr>
+                  <w:rFonts w:ascii="Arial" w:hAnsi="Arial" w:cs="Arial"/>
+                  <w:color w:val="1A1A1A"/>
+                  <w:sz w:val="16"/>
+                  <w:szCs w:val="16"/>
+                </w:rPr>
+                <w:id w:val="1022"/>
+                <w:showingPlcHdr/>
+              </w:sdtPr>
+              <w:sdtContent>
+                <w:r>
+                  <w:rPr>
+                    <w:rFonts w:ascii="Arial" w:cs="Arial" w:eastAsia="Arial" w:hAnsi="Arial"/>
+                    <w:i/>
+                    <w:iCs/>
+                    <w:color w:val="808081"/>
+                    <w:sz w:val="16"/>
+                    <w:szCs w:val="16"/>
+                  </w:rPr>
+                  <w:t xml:space="preserve">[How the company or the thesis offsets this risk.]</w:t>
+                </w:r>
+              </w:sdtContent>
+            </w:sdt>
+          </w:p>
+          <w:p>
+            <w:pPr>
+              <w:pBdr>
+                <w:bottom w:val="single" w:color="E9004B" w:sz="8" w:space="1"/>
+              </w:pBdr>
+              <w:spacing w:after="50" w:before="100"/>
+            </w:pPr>
+            <w:r>
+              <w:rPr>
+                <w:rFonts w:ascii="Arial" w:cs="Arial" w:eastAsia="Arial" w:hAnsi="Arial"/>
+                <w:b/>
+                <w:bCs/>
+                <w:color w:val="14284B"/>
+                <w:sz w:val="16"/>
+                <w:szCs w:val="16"/>
+              </w:rPr>
+              <w:t xml:space="preserve">SENSITIVITY ANALYSIS</w:t>
+            </w:r>
+          </w:p>
+          <w:p>
+            <w:pPr>
+              <w:spacing w:after="40" w:before="0" w:line="228"/>
+              <w:jc w:val="both"/>
+            </w:pPr>
+            <w:sdt>
+              <w:sdtPr>
+                <w:rPr>
+                  <w:rFonts w:ascii="Arial" w:hAnsi="Arial" w:cs="Arial"/>
+                  <w:color w:val="1A1A1A"/>
+                  <w:sz w:val="16"/>
+                  <w:szCs w:val="16"/>
+                </w:rPr>
                 <w:id w:val="1023"/>
                 <w:showingPlcHdr/>
               </w:sdtPr>
@@ -1186,7 +1084,7 @@
                     <w:sz w:val="16"/>
                     <w:szCs w:val="16"/>
                   </w:rPr>
-                  <w:t xml:space="preserve">[How the company or the thesis offsets this risk.]</w:t>
+                  <w:t xml:space="preserve">[Comment on Figures 2–4: which drivers move the value per share most, the downside versus the base case, and whether the recommendation holds.]</w:t>
                 </w:r>
               </w:sdtContent>
             </w:sdt>
@@ -1216,7 +1114,7 @@
         </w:tc>
         <w:tc>
           <w:tcPr>
-            <w:tcW w:type="dxa" w:w="4700"/>
+            <w:tcW w:type="dxa" w:w="3800"/>
             <w:tcBorders>
               <w:top w:val="none" w:color="FFFFFF" w:sz="0"/>
               <w:left w:val="none" w:color="FFFFFF" w:sz="0"/>
@@ -1244,7 +1142,7 @@
                 <w:sz w:val="14"/>
                 <w:szCs w:val="14"/>
               </w:rPr>
-              <w:t xml:space="preserve">Figure 2: </w:t>
+              <w:t xml:space="preserve">Figure 1: </w:t>
             </w:r>
             <w:r>
               <w:rPr>
@@ -1253,7 +1151,7 @@
                 <w:sz w:val="14"/>
                 <w:szCs w:val="14"/>
               </w:rPr>
-              <w:t xml:space="preserve">Operational risk tornado (value per share, CLP)</w:t>
+              <w:t xml:space="preserve">Risk matrix</w:t>
             </w:r>
           </w:p>
           <w:p>
@@ -1264,7 +1162,78 @@
             <w:r>
               <w:drawing>
                 <wp:inline distT="0" distB="0" distL="0" distR="0">
-                  <wp:extent cx="2984500" cy="1865313"/>
+                  <wp:extent cx="2075180" cy="2334578"/>
+                  <wp:effectExtent t="0" r="0" b="0" l="0"/>
+                  <wp:docPr id="1" name="matriz_riesgo.png" descr="matriz_riesgo.png" title="matriz_riesgo.png"/>
+                  <wp:cNvGraphicFramePr>
+                    <a:graphicFrameLocks xmlns:a="http://schemas.openxmlformats.org/drawingml/2006/main" noChangeAspect="1"/>
+                  </wp:cNvGraphicFramePr>
+                  <a:graphic xmlns:a="http://schemas.openxmlformats.org/drawingml/2006/main">
+                    <a:graphicData uri="http://schemas.openxmlformats.org/drawingml/2006/picture">
+                      <pic:pic xmlns:pic="http://schemas.openxmlformats.org/drawingml/2006/picture">
+                        <pic:nvPicPr>
+                          <pic:cNvPr id="0" name="" descr=""/>
+                          <pic:cNvPicPr>
+                            <a:picLocks noChangeAspect="1" noChangeArrowheads="1"/>
+                          </pic:cNvPicPr>
+                        </pic:nvPicPr>
+                        <pic:blipFill>
+                          <a:blip r:embed="rId7" cstate="none"/>
+                          <a:srcRect/>
+                          <a:stretch>
+                            <a:fillRect/>
+                          </a:stretch>
+                        </pic:blipFill>
+                        <pic:spPr bwMode="auto">
+                          <a:xfrm>
+                            <a:off x="0" y="0"/>
+                            <a:ext cx="2075180" cy="2334578"/>
+                          </a:xfrm>
+                          <a:prstGeom prst="rect">
+                            <a:avLst/>
+                          </a:prstGeom>
+                        </pic:spPr>
+                      </pic:pic>
+                    </a:graphicData>
+                  </a:graphic>
+                </wp:inline>
+              </w:drawing>
+            </w:r>
+          </w:p>
+          <w:p>
+            <w:pPr>
+              <w:spacing w:after="20" w:before="60"/>
+            </w:pPr>
+            <w:r>
+              <w:rPr>
+                <w:rFonts w:ascii="Arial" w:cs="Arial" w:eastAsia="Arial" w:hAnsi="Arial"/>
+                <w:b/>
+                <w:bCs/>
+                <w:color w:val="14284B"/>
+                <w:sz w:val="14"/>
+                <w:szCs w:val="14"/>
+              </w:rPr>
+              <w:t xml:space="preserve">Figure 2: </w:t>
+            </w:r>
+            <w:r>
+              <w:rPr>
+                <w:rFonts w:ascii="Arial" w:cs="Arial" w:eastAsia="Arial" w:hAnsi="Arial"/>
+                <w:color w:val="14284B"/>
+                <w:sz w:val="14"/>
+                <w:szCs w:val="14"/>
+              </w:rPr>
+              <w:t xml:space="preserve">Operational risk tornado (value per share, CLP)</w:t>
+            </w:r>
+          </w:p>
+          <w:p>
+            <w:pPr>
+              <w:spacing w:after="0"/>
+              <w:jc w:val="center"/>
+            </w:pPr>
+            <w:r>
+              <w:drawing>
+                <wp:inline distT="0" distB="0" distL="0" distR="0">
+                  <wp:extent cx="2413000" cy="1508125"/>
                   <wp:effectExtent t="0" r="0" b="0" l="0"/>
                   <wp:docPr id="1" name="tornado_operacional.png" descr="tornado_operacional.png" title="tornado_operacional.png"/>
                   <wp:cNvGraphicFramePr>
@@ -1289,7 +1258,7 @@
                         <pic:spPr bwMode="auto">
                           <a:xfrm>
                             <a:off x="0" y="0"/>
-                            <a:ext cx="2984500" cy="1865313"/>
+                            <a:ext cx="2413000" cy="1508125"/>
                           </a:xfrm>
                           <a:prstGeom prst="rect">
                             <a:avLst/>
@@ -1335,7 +1304,7 @@
             <w:r>
               <w:drawing>
                 <wp:inline distT="0" distB="0" distL="0" distR="0">
-                  <wp:extent cx="2984500" cy="1865313"/>
+                  <wp:extent cx="2413000" cy="1508125"/>
                   <wp:effectExtent t="0" r="0" b="0" l="0"/>
                   <wp:docPr id="1" name="heatmap_sensibilidad_wacc.png" descr="heatmap_sensibilidad_wacc.png" title="heatmap_sensibilidad_wacc.png"/>
                   <wp:cNvGraphicFramePr>
@@ -1360,7 +1329,7 @@
                         <pic:spPr bwMode="auto">
                           <a:xfrm>
                             <a:off x="0" y="0"/>
-                            <a:ext cx="2984500" cy="1865313"/>
+                            <a:ext cx="2413000" cy="1508125"/>
                           </a:xfrm>
                           <a:prstGeom prst="rect">
                             <a:avLst/>
@@ -1406,7 +1375,7 @@
             <w:r>
               <w:drawing>
                 <wp:inline distT="0" distB="0" distL="0" distR="0">
-                  <wp:extent cx="2984500" cy="1678781"/>
+                  <wp:extent cx="2413000" cy="1357313"/>
                   <wp:effectExtent t="0" r="0" b="0" l="0"/>
                   <wp:docPr id="1" name="reajuste_uf.png" descr="reajuste_uf.png" title="reajuste_uf.png"/>
                   <wp:cNvGraphicFramePr>
@@ -1431,7 +1400,7 @@
                         <pic:spPr bwMode="auto">
                           <a:xfrm>
                             <a:off x="0" y="0"/>
-                            <a:ext cx="2984500" cy="1678781"/>
+                            <a:ext cx="2413000" cy="1357313"/>
                           </a:xfrm>
                           <a:prstGeom prst="rect">
                             <a:avLst/>
@@ -1443,87 +1412,6 @@
                 </wp:inline>
               </w:drawing>
             </w:r>
-          </w:p>
-          <w:p>
-            <w:pPr>
-              <w:pBdr>
-                <w:bottom w:val="single" w:color="E9004B" w:sz="8" w:space="1"/>
-              </w:pBdr>
-              <w:spacing w:after="50" w:before="100"/>
-            </w:pPr>
-            <w:r>
-              <w:rPr>
-                <w:rFonts w:ascii="Arial" w:cs="Arial" w:eastAsia="Arial" w:hAnsi="Arial"/>
-                <w:b/>
-                <w:bCs/>
-                <w:color w:val="14284B"/>
-                <w:sz w:val="16"/>
-                <w:szCs w:val="16"/>
-              </w:rPr>
-              <w:t xml:space="preserve">SENSITIVITY ANALYSIS</w:t>
-            </w:r>
-          </w:p>
-          <w:p>
-            <w:pPr>
-              <w:spacing w:after="40" w:before="0" w:line="228"/>
-              <w:jc w:val="both"/>
-            </w:pPr>
-            <w:sdt>
-              <w:sdtPr>
-                <w:rPr>
-                  <w:rFonts w:ascii="Arial" w:hAnsi="Arial" w:cs="Arial"/>
-                  <w:color w:val="1A1A1A"/>
-                  <w:sz w:val="16"/>
-                  <w:szCs w:val="16"/>
-                </w:rPr>
-                <w:id w:val="1024"/>
-                <w:showingPlcHdr/>
-              </w:sdtPr>
-              <w:sdtContent>
-                <w:r>
-                  <w:rPr>
-                    <w:rFonts w:ascii="Arial" w:cs="Arial" w:eastAsia="Arial" w:hAnsi="Arial"/>
-                    <w:i/>
-                    <w:iCs/>
-                    <w:color w:val="808081"/>
-                    <w:sz w:val="16"/>
-                    <w:szCs w:val="16"/>
-                  </w:rPr>
-                  <w:t xml:space="preserve">[Comment on Figures 2–4: which drivers move the value per share most, and the downside versus the base case.]</w:t>
-                </w:r>
-              </w:sdtContent>
-            </w:sdt>
-          </w:p>
-          <w:p>
-            <w:pPr>
-              <w:spacing w:after="40" w:before="0" w:line="228"/>
-              <w:jc w:val="both"/>
-            </w:pPr>
-            <w:sdt>
-              <w:sdtPr>
-                <w:rPr>
-                  <w:rFonts w:ascii="Arial" w:hAnsi="Arial" w:cs="Arial"/>
-                  <w:color w:val="1A1A1A"/>
-                  <w:sz w:val="16"/>
-                  <w:szCs w:val="16"/>
-                </w:rPr>
-                <w:id w:val="1025"/>
-                <w:showingPlcHdr/>
-              </w:sdtPr>
-              <w:sdtContent>
-                <w:r>
-                  <w:rPr>
-                    <w:rFonts w:ascii="Arial" w:cs="Arial" w:eastAsia="Arial" w:hAnsi="Arial"/>
-                    <w:i/>
-                    <w:iCs/>
-                    <w:color w:val="808081"/>
-                    <w:sz w:val="16"/>
-                    <w:szCs w:val="16"/>
-                  </w:rPr>
-                  <w:t xml:space="preserve">[Conclusion: whether the recommendation holds under the downside scenarios.]</w:t>
-                </w:r>
-              </w:sdtContent>
-            </w:sdt>
           </w:p>
         </w:tc>
       </w:tr>

</xml_diff>

<commit_message>
Render report-sized figures for the Investment Risks page
Charts are drawn at the exact column width (400 dpi) with readable fonts and sized
so the figure column runs to the bottom of the page.

Co-Authored-By: Claude Opus 5.5 <noreply@anthropic.com>
Claude-Session: https://claude.ai/code/session_0188QZHBkA8n5QL7BtmFakQg
</commit_message>
<xml_diff>
--- a/informe/Investment_Risks_template.docx
+++ b/informe/Investment_Risks_template.docx
@@ -1162,9 +1162,9 @@
             <w:r>
               <w:drawing>
                 <wp:inline distT="0" distB="0" distL="0" distR="0">
-                  <wp:extent cx="2075180" cy="2334578"/>
+                  <wp:extent cx="2413000" cy="2332948"/>
                   <wp:effectExtent t="0" r="0" b="0" l="0"/>
-                  <wp:docPr id="1" name="matriz_riesgo.png" descr="matriz_riesgo.png" title="matriz_riesgo.png"/>
+                  <wp:docPr id="1" name="fig1_matriz_riesgo.png" descr="fig1_matriz_riesgo.png" title="fig1_matriz_riesgo.png"/>
                   <wp:cNvGraphicFramePr>
                     <a:graphicFrameLocks xmlns:a="http://schemas.openxmlformats.org/drawingml/2006/main" noChangeAspect="1"/>
                   </wp:cNvGraphicFramePr>
@@ -1187,7 +1187,7 @@
                         <pic:spPr bwMode="auto">
                           <a:xfrm>
                             <a:off x="0" y="0"/>
-                            <a:ext cx="2075180" cy="2334578"/>
+                            <a:ext cx="2413000" cy="2332948"/>
                           </a:xfrm>
                           <a:prstGeom prst="rect">
                             <a:avLst/>
@@ -1233,9 +1233,9 @@
             <w:r>
               <w:drawing>
                 <wp:inline distT="0" distB="0" distL="0" distR="0">
-                  <wp:extent cx="2413000" cy="1508125"/>
+                  <wp:extent cx="2413000" cy="2332948"/>
                   <wp:effectExtent t="0" r="0" b="0" l="0"/>
-                  <wp:docPr id="1" name="tornado_operacional.png" descr="tornado_operacional.png" title="tornado_operacional.png"/>
+                  <wp:docPr id="1" name="fig2_tornado.png" descr="fig2_tornado.png" title="fig2_tornado.png"/>
                   <wp:cNvGraphicFramePr>
                     <a:graphicFrameLocks xmlns:a="http://schemas.openxmlformats.org/drawingml/2006/main" noChangeAspect="1"/>
                   </wp:cNvGraphicFramePr>
@@ -1258,7 +1258,7 @@
                         <pic:spPr bwMode="auto">
                           <a:xfrm>
                             <a:off x="0" y="0"/>
-                            <a:ext cx="2413000" cy="1508125"/>
+                            <a:ext cx="2413000" cy="2332948"/>
                           </a:xfrm>
                           <a:prstGeom prst="rect">
                             <a:avLst/>
@@ -1304,9 +1304,9 @@
             <w:r>
               <w:drawing>
                 <wp:inline distT="0" distB="0" distL="0" distR="0">
-                  <wp:extent cx="2413000" cy="1508125"/>
+                  <wp:extent cx="2413000" cy="1829763"/>
                   <wp:effectExtent t="0" r="0" b="0" l="0"/>
-                  <wp:docPr id="1" name="heatmap_sensibilidad_wacc.png" descr="heatmap_sensibilidad_wacc.png" title="heatmap_sensibilidad_wacc.png"/>
+                  <wp:docPr id="1" name="fig3_heatmap.png" descr="fig3_heatmap.png" title="fig3_heatmap.png"/>
                   <wp:cNvGraphicFramePr>
                     <a:graphicFrameLocks xmlns:a="http://schemas.openxmlformats.org/drawingml/2006/main" noChangeAspect="1"/>
                   </wp:cNvGraphicFramePr>
@@ -1329,7 +1329,7 @@
                         <pic:spPr bwMode="auto">
                           <a:xfrm>
                             <a:off x="0" y="0"/>
-                            <a:ext cx="2413000" cy="1508125"/>
+                            <a:ext cx="2413000" cy="1829763"/>
                           </a:xfrm>
                           <a:prstGeom prst="rect">
                             <a:avLst/>
@@ -1375,9 +1375,9 @@
             <w:r>
               <w:drawing>
                 <wp:inline distT="0" distB="0" distL="0" distR="0">
-                  <wp:extent cx="2413000" cy="1357313"/>
+                  <wp:extent cx="2413000" cy="1601043"/>
                   <wp:effectExtent t="0" r="0" b="0" l="0"/>
-                  <wp:docPr id="1" name="reajuste_uf.png" descr="reajuste_uf.png" title="reajuste_uf.png"/>
+                  <wp:docPr id="1" name="fig4_uf.png" descr="fig4_uf.png" title="fig4_uf.png"/>
                   <wp:cNvGraphicFramePr>
                     <a:graphicFrameLocks xmlns:a="http://schemas.openxmlformats.org/drawingml/2006/main" noChangeAspect="1"/>
                   </wp:cNvGraphicFramePr>
@@ -1400,7 +1400,7 @@
                         <pic:spPr bwMode="auto">
                           <a:xfrm>
                             <a:off x="0" y="0"/>
-                            <a:ext cx="2413000" cy="1357313"/>
+                            <a:ext cx="2413000" cy="1601043"/>
                           </a:xfrm>
                           <a:prstGeom prst="rect">
                             <a:avLst/>

</xml_diff>

<commit_message>
Restore structured risk layout with descriptions inline after each risk title
Co-Authored-By: Claude Opus 5.5 <noreply@anthropic.com>
Claude-Session: https://claude.ai/code/session_0188QZHBkA8n5QL7BtmFakQg
</commit_message>
<xml_diff>
--- a/informe/Investment_Risks_template.docx
+++ b/informe/Investment_Risks_template.docx
@@ -21,23 +21,23 @@
         <w:t xml:space="preserve">INVESTMENT RISKS</w:t>
       </w:r>
     </w:p>
-    <w:sdt>
-      <w:sdtPr>
-        <w:rPr>
-          <w:rFonts w:ascii="Arial" w:hAnsi="Arial" w:cs="Arial"/>
-          <w:color w:val="1A1A1A"/>
-          <w:sz w:val="16"/>
-          <w:szCs w:val="16"/>
-        </w:rPr>
-        <w:id w:val="1000"/>
-        <w:showingPlcHdr/>
-      </w:sdtPr>
-      <w:sdtContent>
-        <w:p>
-          <w:pPr>
-            <w:shd w:fill="EEF1F6" w:color="auto" w:val="clear"/>
-            <w:spacing w:after="80" w:line="228"/>
-          </w:pPr>
+    <w:p>
+      <w:pPr>
+        <w:shd w:fill="EEF1F6" w:color="auto" w:val="clear"/>
+        <w:spacing w:after="80" w:line="228"/>
+      </w:pPr>
+      <w:sdt>
+        <w:sdtPr>
+          <w:rPr>
+            <w:rFonts w:ascii="Arial" w:hAnsi="Arial" w:cs="Arial"/>
+            <w:color w:val="1A1A1A"/>
+            <w:sz w:val="16"/>
+            <w:szCs w:val="16"/>
+          </w:rPr>
+          <w:id w:val="1000"/>
+          <w:showingPlcHdr/>
+        </w:sdtPr>
+        <w:sdtContent>
           <w:r>
             <w:rPr>
               <w:rFonts w:ascii="Arial" w:cs="Arial" w:eastAsia="Arial" w:hAnsi="Arial"/>
@@ -49,9 +49,9 @@
             </w:rPr>
             <w:t xml:space="preserve">[Summary: overall risk view for Mallplaza and the main risks to the recommendation and target price.]</w:t>
           </w:r>
-        </w:p>
-      </w:sdtContent>
-    </w:sdt>
+        </w:sdtContent>
+      </w:sdt>
+    </w:p>
     <w:tbl>
       <w:tblPr>
         <w:tblW w:type="dxa" w:w="11000"/>
@@ -106,41 +106,36 @@
               <w:t xml:space="preserve">RISK ASSESSMENT</w:t>
             </w:r>
           </w:p>
-          <w:sdt>
-            <w:sdtPr>
-              <w:rPr>
-                <w:rFonts w:ascii="Arial" w:hAnsi="Arial" w:cs="Arial"/>
-                <w:color w:val="1A1A1A"/>
-                <w:sz w:val="16"/>
-                <w:szCs w:val="16"/>
-              </w:rPr>
-              <w:id w:val="1001"/>
-              <w:showingPlcHdr/>
-            </w:sdtPr>
-            <w:sdtContent>
-              <w:p>
-                <w:pPr>
-                  <w:spacing w:after="0" w:before="0" w:line="228"/>
-                  <w:jc w:val="both"/>
-                </w:pPr>
-                <w:r>
-                  <w:rPr>
-                    <w:rFonts w:ascii="Arial" w:cs="Arial" w:eastAsia="Arial" w:hAnsi="Arial"/>
-                    <w:i/>
-                    <w:iCs/>
-                    <w:color w:val="808081"/>
-                    <w:sz w:val="16"/>
-                    <w:szCs w:val="16"/>
-                  </w:rPr>
-                  <w:t xml:space="preserve">[Write here: how likelihood and impact were scored (1–5) in Figure 1 and which risks fall in the high-risk zone.]</w:t>
-                </w:r>
-              </w:p>
-            </w:sdtContent>
-          </w:sdt>
-          <w:p>
-            <w:pPr>
-              <w:spacing w:after="0" w:before="0" w:line="500" w:lineRule="exact"/>
-            </w:pPr>
+          <w:p>
+            <w:pPr>
+              <w:spacing w:after="40" w:before="0" w:line="228"/>
+              <w:jc w:val="both"/>
+            </w:pPr>
+            <w:sdt>
+              <w:sdtPr>
+                <w:rPr>
+                  <w:rFonts w:ascii="Arial" w:hAnsi="Arial" w:cs="Arial"/>
+                  <w:color w:val="1A1A1A"/>
+                  <w:sz w:val="16"/>
+                  <w:szCs w:val="16"/>
+                </w:rPr>
+                <w:id w:val="1001"/>
+                <w:showingPlcHdr/>
+              </w:sdtPr>
+              <w:sdtContent>
+                <w:r>
+                  <w:rPr>
+                    <w:rFonts w:ascii="Arial" w:cs="Arial" w:eastAsia="Arial" w:hAnsi="Arial"/>
+                    <w:i/>
+                    <w:iCs/>
+                    <w:color w:val="808081"/>
+                    <w:sz w:val="16"/>
+                    <w:szCs w:val="16"/>
+                  </w:rPr>
+                  <w:t xml:space="preserve">[Explain how likelihood and impact were scored (1–5) in Figure 1 and which risks fall in the high-risk zone.]</w:t>
+                </w:r>
+              </w:sdtContent>
+            </w:sdt>
           </w:p>
           <w:p>
             <w:pPr>
@@ -161,41 +156,368 @@
               <w:t xml:space="preserve">OPERATIONAL RISKS</w:t>
             </w:r>
           </w:p>
-          <w:sdt>
-            <w:sdtPr>
-              <w:rPr>
-                <w:rFonts w:ascii="Arial" w:hAnsi="Arial" w:cs="Arial"/>
-                <w:color w:val="1A1A1A"/>
-                <w:sz w:val="16"/>
-                <w:szCs w:val="16"/>
-              </w:rPr>
-              <w:id w:val="1002"/>
-              <w:showingPlcHdr/>
-            </w:sdtPr>
-            <w:sdtContent>
-              <w:p>
-                <w:pPr>
-                  <w:spacing w:after="0" w:before="0" w:line="228"/>
-                  <w:jc w:val="both"/>
-                </w:pPr>
-                <w:r>
-                  <w:rPr>
-                    <w:rFonts w:ascii="Arial" w:cs="Arial" w:eastAsia="Arial" w:hAnsi="Arial"/>
-                    <w:i/>
-                    <w:iCs/>
-                    <w:color w:val="808081"/>
-                    <w:sz w:val="16"/>
-                    <w:szCs w:val="16"/>
-                  </w:rPr>
-                  <w:t xml:space="preserve">[Write here. Suggested format per risk: OR1 – title (e.g. EBITDA margin compression), description, impact on value (Figure 2) and mitigants. Continue with OR2, OR3…]</w:t>
-                </w:r>
-              </w:p>
-            </w:sdtContent>
-          </w:sdt>
-          <w:p>
-            <w:pPr>
-              <w:spacing w:after="0" w:before="0" w:line="2800" w:lineRule="exact"/>
-            </w:pPr>
+          <w:p>
+            <w:pPr>
+              <w:spacing w:after="10" w:before="0" w:line="228"/>
+              <w:jc w:val="both"/>
+            </w:pPr>
+            <w:r>
+              <w:rPr>
+                <w:rFonts w:ascii="Arial" w:cs="Arial" w:eastAsia="Arial" w:hAnsi="Arial"/>
+                <w:b/>
+                <w:bCs/>
+                <w:color w:val="E9004B"/>
+                <w:sz w:val="16"/>
+                <w:szCs w:val="16"/>
+              </w:rPr>
+              <w:t xml:space="preserve">OR1: </w:t>
+            </w:r>
+            <w:sdt>
+              <w:sdtPr>
+                <w:rPr>
+                  <w:rFonts w:ascii="Arial" w:hAnsi="Arial" w:cs="Arial"/>
+                  <w:b/>
+                  <w:bCs/>
+                  <w:color w:val="1A1A1A"/>
+                  <w:sz w:val="16"/>
+                  <w:szCs w:val="16"/>
+                </w:rPr>
+                <w:id w:val="1002"/>
+                <w:showingPlcHdr/>
+              </w:sdtPr>
+              <w:sdtContent>
+                <w:r>
+                  <w:rPr>
+                    <w:rFonts w:ascii="Arial" w:cs="Arial" w:eastAsia="Arial" w:hAnsi="Arial"/>
+                    <w:b/>
+                    <w:bCs/>
+                    <w:i/>
+                    <w:iCs/>
+                    <w:color w:val="808081"/>
+                    <w:sz w:val="16"/>
+                    <w:szCs w:val="16"/>
+                  </w:rPr>
+                  <w:t xml:space="preserve">[Risk title, e.g. EBITDA margin compression.]</w:t>
+                </w:r>
+              </w:sdtContent>
+            </w:sdt>
+            <w:r>
+              <w:rPr>
+                <w:rFonts w:ascii="Arial" w:cs="Arial" w:eastAsia="Arial" w:hAnsi="Arial"/>
+                <w:sz w:val="16"/>
+                <w:szCs w:val="16"/>
+              </w:rPr>
+              <w:t xml:space="preserve"> </w:t>
+            </w:r>
+            <w:sdt>
+              <w:sdtPr>
+                <w:rPr>
+                  <w:rFonts w:ascii="Arial" w:hAnsi="Arial" w:cs="Arial"/>
+                  <w:color w:val="1A1A1A"/>
+                  <w:sz w:val="16"/>
+                  <w:szCs w:val="16"/>
+                </w:rPr>
+                <w:id w:val="1003"/>
+                <w:showingPlcHdr/>
+              </w:sdtPr>
+              <w:sdtContent>
+                <w:r>
+                  <w:rPr>
+                    <w:rFonts w:ascii="Arial" w:cs="Arial" w:eastAsia="Arial" w:hAnsi="Arial"/>
+                    <w:i/>
+                    <w:iCs/>
+                    <w:color w:val="808081"/>
+                    <w:sz w:val="16"/>
+                    <w:szCs w:val="16"/>
+                  </w:rPr>
+                  <w:t xml:space="preserve">[Describe the risk: what could happen, how likely it is, and its impact on revenue, EBITDA or value per share; reference Figures 1–4 where relevant.]</w:t>
+                </w:r>
+              </w:sdtContent>
+            </w:sdt>
+          </w:p>
+          <w:p>
+            <w:pPr>
+              <w:spacing w:after="50" w:before="0" w:line="228"/>
+              <w:jc w:val="both"/>
+            </w:pPr>
+            <w:r>
+              <w:rPr>
+                <w:rFonts w:ascii="Arial" w:cs="Arial" w:eastAsia="Arial" w:hAnsi="Arial"/>
+                <w:b/>
+                <w:bCs/>
+                <w:color w:val="14284B"/>
+                <w:sz w:val="16"/>
+                <w:szCs w:val="16"/>
+              </w:rPr>
+              <w:t xml:space="preserve">Mitigants: </w:t>
+            </w:r>
+            <w:sdt>
+              <w:sdtPr>
+                <w:rPr>
+                  <w:rFonts w:ascii="Arial" w:hAnsi="Arial" w:cs="Arial"/>
+                  <w:color w:val="1A1A1A"/>
+                  <w:sz w:val="16"/>
+                  <w:szCs w:val="16"/>
+                </w:rPr>
+                <w:id w:val="1004"/>
+                <w:showingPlcHdr/>
+              </w:sdtPr>
+              <w:sdtContent>
+                <w:r>
+                  <w:rPr>
+                    <w:rFonts w:ascii="Arial" w:cs="Arial" w:eastAsia="Arial" w:hAnsi="Arial"/>
+                    <w:i/>
+                    <w:iCs/>
+                    <w:color w:val="808081"/>
+                    <w:sz w:val="16"/>
+                    <w:szCs w:val="16"/>
+                  </w:rPr>
+                  <w:t xml:space="preserve">[How the company or the thesis offsets this risk.]</w:t>
+                </w:r>
+              </w:sdtContent>
+            </w:sdt>
+          </w:p>
+          <w:p>
+            <w:pPr>
+              <w:spacing w:after="10" w:before="0" w:line="228"/>
+              <w:jc w:val="both"/>
+            </w:pPr>
+            <w:r>
+              <w:rPr>
+                <w:rFonts w:ascii="Arial" w:cs="Arial" w:eastAsia="Arial" w:hAnsi="Arial"/>
+                <w:b/>
+                <w:bCs/>
+                <w:color w:val="E9004B"/>
+                <w:sz w:val="16"/>
+                <w:szCs w:val="16"/>
+              </w:rPr>
+              <w:t xml:space="preserve">OR2: </w:t>
+            </w:r>
+            <w:sdt>
+              <w:sdtPr>
+                <w:rPr>
+                  <w:rFonts w:ascii="Arial" w:hAnsi="Arial" w:cs="Arial"/>
+                  <w:b/>
+                  <w:bCs/>
+                  <w:color w:val="1A1A1A"/>
+                  <w:sz w:val="16"/>
+                  <w:szCs w:val="16"/>
+                </w:rPr>
+                <w:id w:val="1005"/>
+                <w:showingPlcHdr/>
+              </w:sdtPr>
+              <w:sdtContent>
+                <w:r>
+                  <w:rPr>
+                    <w:rFonts w:ascii="Arial" w:cs="Arial" w:eastAsia="Arial" w:hAnsi="Arial"/>
+                    <w:b/>
+                    <w:bCs/>
+                    <w:i/>
+                    <w:iCs/>
+                    <w:color w:val="808081"/>
+                    <w:sz w:val="16"/>
+                    <w:szCs w:val="16"/>
+                  </w:rPr>
+                  <w:t xml:space="preserve">[Risk title, e.g. slowdown in same-store rent growth.]</w:t>
+                </w:r>
+              </w:sdtContent>
+            </w:sdt>
+            <w:r>
+              <w:rPr>
+                <w:rFonts w:ascii="Arial" w:cs="Arial" w:eastAsia="Arial" w:hAnsi="Arial"/>
+                <w:sz w:val="16"/>
+                <w:szCs w:val="16"/>
+              </w:rPr>
+              <w:t xml:space="preserve"> </w:t>
+            </w:r>
+            <w:sdt>
+              <w:sdtPr>
+                <w:rPr>
+                  <w:rFonts w:ascii="Arial" w:hAnsi="Arial" w:cs="Arial"/>
+                  <w:color w:val="1A1A1A"/>
+                  <w:sz w:val="16"/>
+                  <w:szCs w:val="16"/>
+                </w:rPr>
+                <w:id w:val="1006"/>
+                <w:showingPlcHdr/>
+              </w:sdtPr>
+              <w:sdtContent>
+                <w:r>
+                  <w:rPr>
+                    <w:rFonts w:ascii="Arial" w:cs="Arial" w:eastAsia="Arial" w:hAnsi="Arial"/>
+                    <w:i/>
+                    <w:iCs/>
+                    <w:color w:val="808081"/>
+                    <w:sz w:val="16"/>
+                    <w:szCs w:val="16"/>
+                  </w:rPr>
+                  <w:t xml:space="preserve">[Describe the risk: what could happen, how likely it is, and its impact on revenue, EBITDA or value per share; reference Figures 1–4 where relevant.]</w:t>
+                </w:r>
+              </w:sdtContent>
+            </w:sdt>
+          </w:p>
+          <w:p>
+            <w:pPr>
+              <w:spacing w:after="50" w:before="0" w:line="228"/>
+              <w:jc w:val="both"/>
+            </w:pPr>
+            <w:r>
+              <w:rPr>
+                <w:rFonts w:ascii="Arial" w:cs="Arial" w:eastAsia="Arial" w:hAnsi="Arial"/>
+                <w:b/>
+                <w:bCs/>
+                <w:color w:val="14284B"/>
+                <w:sz w:val="16"/>
+                <w:szCs w:val="16"/>
+              </w:rPr>
+              <w:t xml:space="preserve">Mitigants: </w:t>
+            </w:r>
+            <w:sdt>
+              <w:sdtPr>
+                <w:rPr>
+                  <w:rFonts w:ascii="Arial" w:hAnsi="Arial" w:cs="Arial"/>
+                  <w:color w:val="1A1A1A"/>
+                  <w:sz w:val="16"/>
+                  <w:szCs w:val="16"/>
+                </w:rPr>
+                <w:id w:val="1007"/>
+                <w:showingPlcHdr/>
+              </w:sdtPr>
+              <w:sdtContent>
+                <w:r>
+                  <w:rPr>
+                    <w:rFonts w:ascii="Arial" w:cs="Arial" w:eastAsia="Arial" w:hAnsi="Arial"/>
+                    <w:i/>
+                    <w:iCs/>
+                    <w:color w:val="808081"/>
+                    <w:sz w:val="16"/>
+                    <w:szCs w:val="16"/>
+                  </w:rPr>
+                  <w:t xml:space="preserve">[How the company or the thesis offsets this risk.]</w:t>
+                </w:r>
+              </w:sdtContent>
+            </w:sdt>
+          </w:p>
+          <w:p>
+            <w:pPr>
+              <w:spacing w:after="10" w:before="0" w:line="228"/>
+              <w:jc w:val="both"/>
+            </w:pPr>
+            <w:r>
+              <w:rPr>
+                <w:rFonts w:ascii="Arial" w:cs="Arial" w:eastAsia="Arial" w:hAnsi="Arial"/>
+                <w:b/>
+                <w:bCs/>
+                <w:color w:val="E9004B"/>
+                <w:sz w:val="16"/>
+                <w:szCs w:val="16"/>
+              </w:rPr>
+              <w:t xml:space="preserve">OR3: </w:t>
+            </w:r>
+            <w:sdt>
+              <w:sdtPr>
+                <w:rPr>
+                  <w:rFonts w:ascii="Arial" w:hAnsi="Arial" w:cs="Arial"/>
+                  <w:b/>
+                  <w:bCs/>
+                  <w:color w:val="1A1A1A"/>
+                  <w:sz w:val="16"/>
+                  <w:szCs w:val="16"/>
+                </w:rPr>
+                <w:id w:val="1008"/>
+                <w:showingPlcHdr/>
+              </w:sdtPr>
+              <w:sdtContent>
+                <w:r>
+                  <w:rPr>
+                    <w:rFonts w:ascii="Arial" w:cs="Arial" w:eastAsia="Arial" w:hAnsi="Arial"/>
+                    <w:b/>
+                    <w:bCs/>
+                    <w:i/>
+                    <w:iCs/>
+                    <w:color w:val="808081"/>
+                    <w:sz w:val="16"/>
+                    <w:szCs w:val="16"/>
+                  </w:rPr>
+                  <w:t xml:space="preserve">[Risk title, e.g. higher maintenance capex.]</w:t>
+                </w:r>
+              </w:sdtContent>
+            </w:sdt>
+            <w:r>
+              <w:rPr>
+                <w:rFonts w:ascii="Arial" w:cs="Arial" w:eastAsia="Arial" w:hAnsi="Arial"/>
+                <w:sz w:val="16"/>
+                <w:szCs w:val="16"/>
+              </w:rPr>
+              <w:t xml:space="preserve"> </w:t>
+            </w:r>
+            <w:sdt>
+              <w:sdtPr>
+                <w:rPr>
+                  <w:rFonts w:ascii="Arial" w:hAnsi="Arial" w:cs="Arial"/>
+                  <w:color w:val="1A1A1A"/>
+                  <w:sz w:val="16"/>
+                  <w:szCs w:val="16"/>
+                </w:rPr>
+                <w:id w:val="1009"/>
+                <w:showingPlcHdr/>
+              </w:sdtPr>
+              <w:sdtContent>
+                <w:r>
+                  <w:rPr>
+                    <w:rFonts w:ascii="Arial" w:cs="Arial" w:eastAsia="Arial" w:hAnsi="Arial"/>
+                    <w:i/>
+                    <w:iCs/>
+                    <w:color w:val="808081"/>
+                    <w:sz w:val="16"/>
+                    <w:szCs w:val="16"/>
+                  </w:rPr>
+                  <w:t xml:space="preserve">[Describe the risk: what could happen, how likely it is, and its impact on revenue, EBITDA or value per share; reference Figures 1–4 where relevant.]</w:t>
+                </w:r>
+              </w:sdtContent>
+            </w:sdt>
+          </w:p>
+          <w:p>
+            <w:pPr>
+              <w:spacing w:after="50" w:before="0" w:line="228"/>
+              <w:jc w:val="both"/>
+            </w:pPr>
+            <w:r>
+              <w:rPr>
+                <w:rFonts w:ascii="Arial" w:cs="Arial" w:eastAsia="Arial" w:hAnsi="Arial"/>
+                <w:b/>
+                <w:bCs/>
+                <w:color w:val="14284B"/>
+                <w:sz w:val="16"/>
+                <w:szCs w:val="16"/>
+              </w:rPr>
+              <w:t xml:space="preserve">Mitigants: </w:t>
+            </w:r>
+            <w:sdt>
+              <w:sdtPr>
+                <w:rPr>
+                  <w:rFonts w:ascii="Arial" w:hAnsi="Arial" w:cs="Arial"/>
+                  <w:color w:val="1A1A1A"/>
+                  <w:sz w:val="16"/>
+                  <w:szCs w:val="16"/>
+                </w:rPr>
+                <w:id w:val="1010"/>
+                <w:showingPlcHdr/>
+              </w:sdtPr>
+              <w:sdtContent>
+                <w:r>
+                  <w:rPr>
+                    <w:rFonts w:ascii="Arial" w:cs="Arial" w:eastAsia="Arial" w:hAnsi="Arial"/>
+                    <w:i/>
+                    <w:iCs/>
+                    <w:color w:val="808081"/>
+                    <w:sz w:val="16"/>
+                    <w:szCs w:val="16"/>
+                  </w:rPr>
+                  <w:t xml:space="preserve">[How the company or the thesis offsets this risk.]</w:t>
+                </w:r>
+              </w:sdtContent>
+            </w:sdt>
           </w:p>
           <w:p>
             <w:pPr>
@@ -216,41 +538,247 @@
               <w:t xml:space="preserve">FINANCIAL RISKS</w:t>
             </w:r>
           </w:p>
-          <w:sdt>
-            <w:sdtPr>
-              <w:rPr>
-                <w:rFonts w:ascii="Arial" w:hAnsi="Arial" w:cs="Arial"/>
-                <w:color w:val="1A1A1A"/>
-                <w:sz w:val="16"/>
-                <w:szCs w:val="16"/>
-              </w:rPr>
-              <w:id w:val="1003"/>
-              <w:showingPlcHdr/>
-            </w:sdtPr>
-            <w:sdtContent>
-              <w:p>
-                <w:pPr>
-                  <w:spacing w:after="0" w:before="0" w:line="228"/>
-                  <w:jc w:val="both"/>
-                </w:pPr>
-                <w:r>
-                  <w:rPr>
-                    <w:rFonts w:ascii="Arial" w:cs="Arial" w:eastAsia="Arial" w:hAnsi="Arial"/>
-                    <w:i/>
-                    <w:iCs/>
-                    <w:color w:val="808081"/>
-                    <w:sz w:val="16"/>
-                    <w:szCs w:val="16"/>
-                  </w:rPr>
-                  <w:t xml:space="preserve">[Write here. e.g. FR1 – revaluation of UF-indexed debt (Figure 4); FR2 – higher cost of capital (Figure 3). Include description and mitigants.]</w:t>
-                </w:r>
-              </w:p>
-            </w:sdtContent>
-          </w:sdt>
-          <w:p>
-            <w:pPr>
-              <w:spacing w:after="0" w:before="0" w:line="1700" w:lineRule="exact"/>
-            </w:pPr>
+          <w:p>
+            <w:pPr>
+              <w:spacing w:after="10" w:before="0" w:line="228"/>
+              <w:jc w:val="both"/>
+            </w:pPr>
+            <w:r>
+              <w:rPr>
+                <w:rFonts w:ascii="Arial" w:cs="Arial" w:eastAsia="Arial" w:hAnsi="Arial"/>
+                <w:b/>
+                <w:bCs/>
+                <w:color w:val="E9004B"/>
+                <w:sz w:val="16"/>
+                <w:szCs w:val="16"/>
+              </w:rPr>
+              <w:t xml:space="preserve">FR1: </w:t>
+            </w:r>
+            <w:sdt>
+              <w:sdtPr>
+                <w:rPr>
+                  <w:rFonts w:ascii="Arial" w:hAnsi="Arial" w:cs="Arial"/>
+                  <w:b/>
+                  <w:bCs/>
+                  <w:color w:val="1A1A1A"/>
+                  <w:sz w:val="16"/>
+                  <w:szCs w:val="16"/>
+                </w:rPr>
+                <w:id w:val="1011"/>
+                <w:showingPlcHdr/>
+              </w:sdtPr>
+              <w:sdtContent>
+                <w:r>
+                  <w:rPr>
+                    <w:rFonts w:ascii="Arial" w:cs="Arial" w:eastAsia="Arial" w:hAnsi="Arial"/>
+                    <w:b/>
+                    <w:bCs/>
+                    <w:i/>
+                    <w:iCs/>
+                    <w:color w:val="808081"/>
+                    <w:sz w:val="16"/>
+                    <w:szCs w:val="16"/>
+                  </w:rPr>
+                  <w:t xml:space="preserve">[Risk title, e.g. revaluation of UF-indexed debt.]</w:t>
+                </w:r>
+              </w:sdtContent>
+            </w:sdt>
+            <w:r>
+              <w:rPr>
+                <w:rFonts w:ascii="Arial" w:cs="Arial" w:eastAsia="Arial" w:hAnsi="Arial"/>
+                <w:sz w:val="16"/>
+                <w:szCs w:val="16"/>
+              </w:rPr>
+              <w:t xml:space="preserve"> </w:t>
+            </w:r>
+            <w:sdt>
+              <w:sdtPr>
+                <w:rPr>
+                  <w:rFonts w:ascii="Arial" w:hAnsi="Arial" w:cs="Arial"/>
+                  <w:color w:val="1A1A1A"/>
+                  <w:sz w:val="16"/>
+                  <w:szCs w:val="16"/>
+                </w:rPr>
+                <w:id w:val="1012"/>
+                <w:showingPlcHdr/>
+              </w:sdtPr>
+              <w:sdtContent>
+                <w:r>
+                  <w:rPr>
+                    <w:rFonts w:ascii="Arial" w:cs="Arial" w:eastAsia="Arial" w:hAnsi="Arial"/>
+                    <w:i/>
+                    <w:iCs/>
+                    <w:color w:val="808081"/>
+                    <w:sz w:val="16"/>
+                    <w:szCs w:val="16"/>
+                  </w:rPr>
+                  <w:t xml:space="preserve">[Describe the risk: what could happen, how likely it is, and its impact on revenue, EBITDA or value per share; reference Figures 1–4 where relevant.]</w:t>
+                </w:r>
+              </w:sdtContent>
+            </w:sdt>
+          </w:p>
+          <w:p>
+            <w:pPr>
+              <w:spacing w:after="50" w:before="0" w:line="228"/>
+              <w:jc w:val="both"/>
+            </w:pPr>
+            <w:r>
+              <w:rPr>
+                <w:rFonts w:ascii="Arial" w:cs="Arial" w:eastAsia="Arial" w:hAnsi="Arial"/>
+                <w:b/>
+                <w:bCs/>
+                <w:color w:val="14284B"/>
+                <w:sz w:val="16"/>
+                <w:szCs w:val="16"/>
+              </w:rPr>
+              <w:t xml:space="preserve">Mitigants: </w:t>
+            </w:r>
+            <w:sdt>
+              <w:sdtPr>
+                <w:rPr>
+                  <w:rFonts w:ascii="Arial" w:hAnsi="Arial" w:cs="Arial"/>
+                  <w:color w:val="1A1A1A"/>
+                  <w:sz w:val="16"/>
+                  <w:szCs w:val="16"/>
+                </w:rPr>
+                <w:id w:val="1013"/>
+                <w:showingPlcHdr/>
+              </w:sdtPr>
+              <w:sdtContent>
+                <w:r>
+                  <w:rPr>
+                    <w:rFonts w:ascii="Arial" w:cs="Arial" w:eastAsia="Arial" w:hAnsi="Arial"/>
+                    <w:i/>
+                    <w:iCs/>
+                    <w:color w:val="808081"/>
+                    <w:sz w:val="16"/>
+                    <w:szCs w:val="16"/>
+                  </w:rPr>
+                  <w:t xml:space="preserve">[How the company or the thesis offsets this risk.]</w:t>
+                </w:r>
+              </w:sdtContent>
+            </w:sdt>
+          </w:p>
+          <w:p>
+            <w:pPr>
+              <w:spacing w:after="10" w:before="0" w:line="228"/>
+              <w:jc w:val="both"/>
+            </w:pPr>
+            <w:r>
+              <w:rPr>
+                <w:rFonts w:ascii="Arial" w:cs="Arial" w:eastAsia="Arial" w:hAnsi="Arial"/>
+                <w:b/>
+                <w:bCs/>
+                <w:color w:val="E9004B"/>
+                <w:sz w:val="16"/>
+                <w:szCs w:val="16"/>
+              </w:rPr>
+              <w:t xml:space="preserve">FR2: </w:t>
+            </w:r>
+            <w:sdt>
+              <w:sdtPr>
+                <w:rPr>
+                  <w:rFonts w:ascii="Arial" w:hAnsi="Arial" w:cs="Arial"/>
+                  <w:b/>
+                  <w:bCs/>
+                  <w:color w:val="1A1A1A"/>
+                  <w:sz w:val="16"/>
+                  <w:szCs w:val="16"/>
+                </w:rPr>
+                <w:id w:val="1014"/>
+                <w:showingPlcHdr/>
+              </w:sdtPr>
+              <w:sdtContent>
+                <w:r>
+                  <w:rPr>
+                    <w:rFonts w:ascii="Arial" w:cs="Arial" w:eastAsia="Arial" w:hAnsi="Arial"/>
+                    <w:b/>
+                    <w:bCs/>
+                    <w:i/>
+                    <w:iCs/>
+                    <w:color w:val="808081"/>
+                    <w:sz w:val="16"/>
+                    <w:szCs w:val="16"/>
+                  </w:rPr>
+                  <w:t xml:space="preserve">[Risk title, e.g. higher cost of capital.]</w:t>
+                </w:r>
+              </w:sdtContent>
+            </w:sdt>
+            <w:r>
+              <w:rPr>
+                <w:rFonts w:ascii="Arial" w:cs="Arial" w:eastAsia="Arial" w:hAnsi="Arial"/>
+                <w:sz w:val="16"/>
+                <w:szCs w:val="16"/>
+              </w:rPr>
+              <w:t xml:space="preserve"> </w:t>
+            </w:r>
+            <w:sdt>
+              <w:sdtPr>
+                <w:rPr>
+                  <w:rFonts w:ascii="Arial" w:hAnsi="Arial" w:cs="Arial"/>
+                  <w:color w:val="1A1A1A"/>
+                  <w:sz w:val="16"/>
+                  <w:szCs w:val="16"/>
+                </w:rPr>
+                <w:id w:val="1015"/>
+                <w:showingPlcHdr/>
+              </w:sdtPr>
+              <w:sdtContent>
+                <w:r>
+                  <w:rPr>
+                    <w:rFonts w:ascii="Arial" w:cs="Arial" w:eastAsia="Arial" w:hAnsi="Arial"/>
+                    <w:i/>
+                    <w:iCs/>
+                    <w:color w:val="808081"/>
+                    <w:sz w:val="16"/>
+                    <w:szCs w:val="16"/>
+                  </w:rPr>
+                  <w:t xml:space="preserve">[Describe the risk: what could happen, how likely it is, and its impact on revenue, EBITDA or value per share; reference Figures 1–4 where relevant.]</w:t>
+                </w:r>
+              </w:sdtContent>
+            </w:sdt>
+          </w:p>
+          <w:p>
+            <w:pPr>
+              <w:spacing w:after="50" w:before="0" w:line="228"/>
+              <w:jc w:val="both"/>
+            </w:pPr>
+            <w:r>
+              <w:rPr>
+                <w:rFonts w:ascii="Arial" w:cs="Arial" w:eastAsia="Arial" w:hAnsi="Arial"/>
+                <w:b/>
+                <w:bCs/>
+                <w:color w:val="14284B"/>
+                <w:sz w:val="16"/>
+                <w:szCs w:val="16"/>
+              </w:rPr>
+              <w:t xml:space="preserve">Mitigants: </w:t>
+            </w:r>
+            <w:sdt>
+              <w:sdtPr>
+                <w:rPr>
+                  <w:rFonts w:ascii="Arial" w:hAnsi="Arial" w:cs="Arial"/>
+                  <w:color w:val="1A1A1A"/>
+                  <w:sz w:val="16"/>
+                  <w:szCs w:val="16"/>
+                </w:rPr>
+                <w:id w:val="1016"/>
+                <w:showingPlcHdr/>
+              </w:sdtPr>
+              <w:sdtContent>
+                <w:r>
+                  <w:rPr>
+                    <w:rFonts w:ascii="Arial" w:cs="Arial" w:eastAsia="Arial" w:hAnsi="Arial"/>
+                    <w:i/>
+                    <w:iCs/>
+                    <w:color w:val="808081"/>
+                    <w:sz w:val="16"/>
+                    <w:szCs w:val="16"/>
+                  </w:rPr>
+                  <w:t xml:space="preserve">[How the company or the thesis offsets this risk.]</w:t>
+                </w:r>
+              </w:sdtContent>
+            </w:sdt>
           </w:p>
           <w:p>
             <w:pPr>
@@ -271,41 +799,126 @@
               <w:t xml:space="preserve">MARKET &amp; MACROECONOMIC RISKS</w:t>
             </w:r>
           </w:p>
-          <w:sdt>
-            <w:sdtPr>
-              <w:rPr>
-                <w:rFonts w:ascii="Arial" w:hAnsi="Arial" w:cs="Arial"/>
-                <w:color w:val="1A1A1A"/>
-                <w:sz w:val="16"/>
-                <w:szCs w:val="16"/>
-              </w:rPr>
-              <w:id w:val="1004"/>
-              <w:showingPlcHdr/>
-            </w:sdtPr>
-            <w:sdtContent>
-              <w:p>
-                <w:pPr>
-                  <w:spacing w:after="0" w:before="0" w:line="228"/>
-                  <w:jc w:val="both"/>
-                </w:pPr>
-                <w:r>
-                  <w:rPr>
-                    <w:rFonts w:ascii="Arial" w:cs="Arial" w:eastAsia="Arial" w:hAnsi="Arial"/>
-                    <w:i/>
-                    <w:iCs/>
-                    <w:color w:val="808081"/>
-                    <w:sz w:val="16"/>
-                    <w:szCs w:val="16"/>
-                  </w:rPr>
-                  <w:t xml:space="preserve">[Write here. e.g. MR1 – FX exposure in Peru and Colombia. Include description and mitigants.]</w:t>
-                </w:r>
-              </w:p>
-            </w:sdtContent>
-          </w:sdt>
-          <w:p>
-            <w:pPr>
-              <w:spacing w:after="0" w:before="0" w:line="1100" w:lineRule="exact"/>
-            </w:pPr>
+          <w:p>
+            <w:pPr>
+              <w:spacing w:after="10" w:before="0" w:line="228"/>
+              <w:jc w:val="both"/>
+            </w:pPr>
+            <w:r>
+              <w:rPr>
+                <w:rFonts w:ascii="Arial" w:cs="Arial" w:eastAsia="Arial" w:hAnsi="Arial"/>
+                <w:b/>
+                <w:bCs/>
+                <w:color w:val="E9004B"/>
+                <w:sz w:val="16"/>
+                <w:szCs w:val="16"/>
+              </w:rPr>
+              <w:t xml:space="preserve">MR1: </w:t>
+            </w:r>
+            <w:sdt>
+              <w:sdtPr>
+                <w:rPr>
+                  <w:rFonts w:ascii="Arial" w:hAnsi="Arial" w:cs="Arial"/>
+                  <w:b/>
+                  <w:bCs/>
+                  <w:color w:val="1A1A1A"/>
+                  <w:sz w:val="16"/>
+                  <w:szCs w:val="16"/>
+                </w:rPr>
+                <w:id w:val="1017"/>
+                <w:showingPlcHdr/>
+              </w:sdtPr>
+              <w:sdtContent>
+                <w:r>
+                  <w:rPr>
+                    <w:rFonts w:ascii="Arial" w:cs="Arial" w:eastAsia="Arial" w:hAnsi="Arial"/>
+                    <w:b/>
+                    <w:bCs/>
+                    <w:i/>
+                    <w:iCs/>
+                    <w:color w:val="808081"/>
+                    <w:sz w:val="16"/>
+                    <w:szCs w:val="16"/>
+                  </w:rPr>
+                  <w:t xml:space="preserve">[Risk title, e.g. FX exposure in Peru and Colombia.]</w:t>
+                </w:r>
+              </w:sdtContent>
+            </w:sdt>
+            <w:r>
+              <w:rPr>
+                <w:rFonts w:ascii="Arial" w:cs="Arial" w:eastAsia="Arial" w:hAnsi="Arial"/>
+                <w:sz w:val="16"/>
+                <w:szCs w:val="16"/>
+              </w:rPr>
+              <w:t xml:space="preserve"> </w:t>
+            </w:r>
+            <w:sdt>
+              <w:sdtPr>
+                <w:rPr>
+                  <w:rFonts w:ascii="Arial" w:hAnsi="Arial" w:cs="Arial"/>
+                  <w:color w:val="1A1A1A"/>
+                  <w:sz w:val="16"/>
+                  <w:szCs w:val="16"/>
+                </w:rPr>
+                <w:id w:val="1018"/>
+                <w:showingPlcHdr/>
+              </w:sdtPr>
+              <w:sdtContent>
+                <w:r>
+                  <w:rPr>
+                    <w:rFonts w:ascii="Arial" w:cs="Arial" w:eastAsia="Arial" w:hAnsi="Arial"/>
+                    <w:i/>
+                    <w:iCs/>
+                    <w:color w:val="808081"/>
+                    <w:sz w:val="16"/>
+                    <w:szCs w:val="16"/>
+                  </w:rPr>
+                  <w:t xml:space="preserve">[Describe the risk: what could happen, how likely it is, and its impact on revenue, EBITDA or value per share; reference Figures 1–4 where relevant.]</w:t>
+                </w:r>
+              </w:sdtContent>
+            </w:sdt>
+          </w:p>
+          <w:p>
+            <w:pPr>
+              <w:spacing w:after="50" w:before="0" w:line="228"/>
+              <w:jc w:val="both"/>
+            </w:pPr>
+            <w:r>
+              <w:rPr>
+                <w:rFonts w:ascii="Arial" w:cs="Arial" w:eastAsia="Arial" w:hAnsi="Arial"/>
+                <w:b/>
+                <w:bCs/>
+                <w:color w:val="14284B"/>
+                <w:sz w:val="16"/>
+                <w:szCs w:val="16"/>
+              </w:rPr>
+              <w:t xml:space="preserve">Mitigants: </w:t>
+            </w:r>
+            <w:sdt>
+              <w:sdtPr>
+                <w:rPr>
+                  <w:rFonts w:ascii="Arial" w:hAnsi="Arial" w:cs="Arial"/>
+                  <w:color w:val="1A1A1A"/>
+                  <w:sz w:val="16"/>
+                  <w:szCs w:val="16"/>
+                </w:rPr>
+                <w:id w:val="1019"/>
+                <w:showingPlcHdr/>
+              </w:sdtPr>
+              <w:sdtContent>
+                <w:r>
+                  <w:rPr>
+                    <w:rFonts w:ascii="Arial" w:cs="Arial" w:eastAsia="Arial" w:hAnsi="Arial"/>
+                    <w:i/>
+                    <w:iCs/>
+                    <w:color w:val="808081"/>
+                    <w:sz w:val="16"/>
+                    <w:szCs w:val="16"/>
+                  </w:rPr>
+                  <w:t xml:space="preserve">[How the company or the thesis offsets this risk.]</w:t>
+                </w:r>
+              </w:sdtContent>
+            </w:sdt>
           </w:p>
           <w:p>
             <w:pPr>
@@ -326,41 +939,126 @@
               <w:t xml:space="preserve">REGULATORY &amp; ESG RISKS</w:t>
             </w:r>
           </w:p>
-          <w:sdt>
-            <w:sdtPr>
-              <w:rPr>
-                <w:rFonts w:ascii="Arial" w:hAnsi="Arial" w:cs="Arial"/>
-                <w:color w:val="1A1A1A"/>
-                <w:sz w:val="16"/>
-                <w:szCs w:val="16"/>
-              </w:rPr>
-              <w:id w:val="1005"/>
-              <w:showingPlcHdr/>
-            </w:sdtPr>
-            <w:sdtContent>
-              <w:p>
-                <w:pPr>
-                  <w:spacing w:after="0" w:before="0" w:line="228"/>
-                  <w:jc w:val="both"/>
-                </w:pPr>
-                <w:r>
-                  <w:rPr>
-                    <w:rFonts w:ascii="Arial" w:cs="Arial" w:eastAsia="Arial" w:hAnsi="Arial"/>
-                    <w:i/>
-                    <w:iCs/>
-                    <w:color w:val="808081"/>
-                    <w:sz w:val="16"/>
-                    <w:szCs w:val="16"/>
-                  </w:rPr>
-                  <w:t xml:space="preserve">[Write here. e.g. RR1 – related-party transactions. Include description and mitigants.]</w:t>
-                </w:r>
-              </w:p>
-            </w:sdtContent>
-          </w:sdt>
-          <w:p>
-            <w:pPr>
-              <w:spacing w:after="0" w:before="0" w:line="1100" w:lineRule="exact"/>
-            </w:pPr>
+          <w:p>
+            <w:pPr>
+              <w:spacing w:after="10" w:before="0" w:line="228"/>
+              <w:jc w:val="both"/>
+            </w:pPr>
+            <w:r>
+              <w:rPr>
+                <w:rFonts w:ascii="Arial" w:cs="Arial" w:eastAsia="Arial" w:hAnsi="Arial"/>
+                <w:b/>
+                <w:bCs/>
+                <w:color w:val="E9004B"/>
+                <w:sz w:val="16"/>
+                <w:szCs w:val="16"/>
+              </w:rPr>
+              <w:t xml:space="preserve">RR1: </w:t>
+            </w:r>
+            <w:sdt>
+              <w:sdtPr>
+                <w:rPr>
+                  <w:rFonts w:ascii="Arial" w:hAnsi="Arial" w:cs="Arial"/>
+                  <w:b/>
+                  <w:bCs/>
+                  <w:color w:val="1A1A1A"/>
+                  <w:sz w:val="16"/>
+                  <w:szCs w:val="16"/>
+                </w:rPr>
+                <w:id w:val="1020"/>
+                <w:showingPlcHdr/>
+              </w:sdtPr>
+              <w:sdtContent>
+                <w:r>
+                  <w:rPr>
+                    <w:rFonts w:ascii="Arial" w:cs="Arial" w:eastAsia="Arial" w:hAnsi="Arial"/>
+                    <w:b/>
+                    <w:bCs/>
+                    <w:i/>
+                    <w:iCs/>
+                    <w:color w:val="808081"/>
+                    <w:sz w:val="16"/>
+                    <w:szCs w:val="16"/>
+                  </w:rPr>
+                  <w:t xml:space="preserve">[Risk title, e.g. related-party transactions.]</w:t>
+                </w:r>
+              </w:sdtContent>
+            </w:sdt>
+            <w:r>
+              <w:rPr>
+                <w:rFonts w:ascii="Arial" w:cs="Arial" w:eastAsia="Arial" w:hAnsi="Arial"/>
+                <w:sz w:val="16"/>
+                <w:szCs w:val="16"/>
+              </w:rPr>
+              <w:t xml:space="preserve"> </w:t>
+            </w:r>
+            <w:sdt>
+              <w:sdtPr>
+                <w:rPr>
+                  <w:rFonts w:ascii="Arial" w:hAnsi="Arial" w:cs="Arial"/>
+                  <w:color w:val="1A1A1A"/>
+                  <w:sz w:val="16"/>
+                  <w:szCs w:val="16"/>
+                </w:rPr>
+                <w:id w:val="1021"/>
+                <w:showingPlcHdr/>
+              </w:sdtPr>
+              <w:sdtContent>
+                <w:r>
+                  <w:rPr>
+                    <w:rFonts w:ascii="Arial" w:cs="Arial" w:eastAsia="Arial" w:hAnsi="Arial"/>
+                    <w:i/>
+                    <w:iCs/>
+                    <w:color w:val="808081"/>
+                    <w:sz w:val="16"/>
+                    <w:szCs w:val="16"/>
+                  </w:rPr>
+                  <w:t xml:space="preserve">[Describe the risk: what could happen, how likely it is, and its impact on revenue, EBITDA or value per share; reference Figures 1–4 where relevant.]</w:t>
+                </w:r>
+              </w:sdtContent>
+            </w:sdt>
+          </w:p>
+          <w:p>
+            <w:pPr>
+              <w:spacing w:after="50" w:before="0" w:line="228"/>
+              <w:jc w:val="both"/>
+            </w:pPr>
+            <w:r>
+              <w:rPr>
+                <w:rFonts w:ascii="Arial" w:cs="Arial" w:eastAsia="Arial" w:hAnsi="Arial"/>
+                <w:b/>
+                <w:bCs/>
+                <w:color w:val="14284B"/>
+                <w:sz w:val="16"/>
+                <w:szCs w:val="16"/>
+              </w:rPr>
+              <w:t xml:space="preserve">Mitigants: </w:t>
+            </w:r>
+            <w:sdt>
+              <w:sdtPr>
+                <w:rPr>
+                  <w:rFonts w:ascii="Arial" w:hAnsi="Arial" w:cs="Arial"/>
+                  <w:color w:val="1A1A1A"/>
+                  <w:sz w:val="16"/>
+                  <w:szCs w:val="16"/>
+                </w:rPr>
+                <w:id w:val="1022"/>
+                <w:showingPlcHdr/>
+              </w:sdtPr>
+              <w:sdtContent>
+                <w:r>
+                  <w:rPr>
+                    <w:rFonts w:ascii="Arial" w:cs="Arial" w:eastAsia="Arial" w:hAnsi="Arial"/>
+                    <w:i/>
+                    <w:iCs/>
+                    <w:color w:val="808081"/>
+                    <w:sz w:val="16"/>
+                    <w:szCs w:val="16"/>
+                  </w:rPr>
+                  <w:t xml:space="preserve">[How the company or the thesis offsets this risk.]</w:t>
+                </w:r>
+              </w:sdtContent>
+            </w:sdt>
           </w:p>
           <w:p>
             <w:pPr>
@@ -381,41 +1079,36 @@
               <w:t xml:space="preserve">SENSITIVITY ANALYSIS</w:t>
             </w:r>
           </w:p>
-          <w:sdt>
-            <w:sdtPr>
-              <w:rPr>
-                <w:rFonts w:ascii="Arial" w:hAnsi="Arial" w:cs="Arial"/>
-                <w:color w:val="1A1A1A"/>
-                <w:sz w:val="16"/>
-                <w:szCs w:val="16"/>
-              </w:rPr>
-              <w:id w:val="1006"/>
-              <w:showingPlcHdr/>
-            </w:sdtPr>
-            <w:sdtContent>
-              <w:p>
-                <w:pPr>
-                  <w:spacing w:after="0" w:before="0" w:line="228"/>
-                  <w:jc w:val="both"/>
-                </w:pPr>
-                <w:r>
-                  <w:rPr>
-                    <w:rFonts w:ascii="Arial" w:cs="Arial" w:eastAsia="Arial" w:hAnsi="Arial"/>
-                    <w:i/>
-                    <w:iCs/>
-                    <w:color w:val="808081"/>
-                    <w:sz w:val="16"/>
-                    <w:szCs w:val="16"/>
-                  </w:rPr>
-                  <w:t xml:space="preserve">[Write here: which drivers move the value per share most (Figures 2–4), the downside versus the base case, and whether the recommendation holds.]</w:t>
-                </w:r>
-              </w:p>
-            </w:sdtContent>
-          </w:sdt>
-          <w:p>
-            <w:pPr>
-              <w:spacing w:after="0" w:before="0" w:line="1900" w:lineRule="exact"/>
-            </w:pPr>
+          <w:p>
+            <w:pPr>
+              <w:spacing w:after="40" w:before="0" w:line="228"/>
+              <w:jc w:val="both"/>
+            </w:pPr>
+            <w:sdt>
+              <w:sdtPr>
+                <w:rPr>
+                  <w:rFonts w:ascii="Arial" w:hAnsi="Arial" w:cs="Arial"/>
+                  <w:color w:val="1A1A1A"/>
+                  <w:sz w:val="16"/>
+                  <w:szCs w:val="16"/>
+                </w:rPr>
+                <w:id w:val="1023"/>
+                <w:showingPlcHdr/>
+              </w:sdtPr>
+              <w:sdtContent>
+                <w:r>
+                  <w:rPr>
+                    <w:rFonts w:ascii="Arial" w:cs="Arial" w:eastAsia="Arial" w:hAnsi="Arial"/>
+                    <w:i/>
+                    <w:iCs/>
+                    <w:color w:val="808081"/>
+                    <w:sz w:val="16"/>
+                    <w:szCs w:val="16"/>
+                  </w:rPr>
+                  <w:t xml:space="preserve">[Comment on Figures 2–4: which drivers move the value per share most, the downside versus the base case, and whether the recommendation holds.]</w:t>
+                </w:r>
+              </w:sdtContent>
+            </w:sdt>
           </w:p>
         </w:tc>
         <w:tc>

</xml_diff>

<commit_message>
Add full A4 CFA report format template (10 body + 10 appendix pages)
Sections follow the team's order with page budgets; text areas are Word
placeholders and figure slots are empty boxes, except the Investment Risks page.
Risk-page figures are redrawn for the A4 column width.

Co-Authored-By: Claude Opus 5.5 <noreply@anthropic.com>
Claude-Session: https://claude.ai/code/session_0188QZHBkA8n5QL7BtmFakQg
</commit_message>
<xml_diff>
--- a/informe/Investment_Risks_template.docx
+++ b/informe/Investment_Risks_template.docx
@@ -54,7 +54,7 @@
     </w:p>
     <w:tbl>
       <w:tblPr>
-        <w:tblW w:type="dxa" w:w="11000"/>
+        <w:tblW w:type="dxa" w:w="10666"/>
         <w:tblBorders>
           <w:top w:val="none" w:color="FFFFFF" w:sz="0"/>
           <w:left w:val="none" w:color="FFFFFF" w:sz="0"/>
@@ -65,14 +65,17 @@
         </w:tblBorders>
       </w:tblPr>
       <w:tblGrid>
-        <w:gridCol w:w="6950"/>
-        <w:gridCol w:w="250"/>
-        <w:gridCol w:w="3800"/>
+        <w:gridCol w:w="6900"/>
+        <w:gridCol w:w="216"/>
+        <w:gridCol w:w="3550"/>
       </w:tblGrid>
       <w:tr>
+        <w:trPr>
+          <w:trHeight w:val="13650" w:hRule="atLeast"/>
+        </w:trPr>
         <w:tc>
           <w:tcPr>
-            <w:tcW w:type="dxa" w:w="6950"/>
+            <w:tcW w:type="dxa" w:w="6900"/>
             <w:tcBorders>
               <w:top w:val="none" w:color="FFFFFF" w:sz="0"/>
               <w:left w:val="none" w:color="FFFFFF" w:sz="0"/>
@@ -1113,7 +1116,7 @@
         </w:tc>
         <w:tc>
           <w:tcPr>
-            <w:tcW w:type="dxa" w:w="250"/>
+            <w:tcW w:type="dxa" w:w="216"/>
             <w:tcBorders>
               <w:top w:val="none" w:color="FFFFFF" w:sz="0"/>
               <w:left w:val="none" w:color="FFFFFF" w:sz="0"/>
@@ -1135,7 +1138,7 @@
         </w:tc>
         <w:tc>
           <w:tcPr>
-            <w:tcW w:type="dxa" w:w="3800"/>
+            <w:tcW w:type="dxa" w:w="3550"/>
             <w:tcBorders>
               <w:top w:val="none" w:color="FFFFFF" w:sz="0"/>
               <w:left w:val="none" w:color="FFFFFF" w:sz="0"/>
@@ -1183,151 +1186,9 @@
             <w:r>
               <w:drawing>
                 <wp:inline distT="0" distB="0" distL="0" distR="0">
-                  <wp:extent cx="2413000" cy="2332948"/>
+                  <wp:extent cx="2254250" cy="2331983"/>
                   <wp:effectExtent t="0" r="0" b="0" l="0"/>
                   <wp:docPr id="1" name="fig1_matriz_riesgo.png" descr="fig1_matriz_riesgo.png" title="fig1_matriz_riesgo.png"/>
-                  <wp:cNvGraphicFramePr>
-                    <a:graphicFrameLocks xmlns:a="http://schemas.openxmlformats.org/drawingml/2006/main" noChangeAspect="1"/>
-                  </wp:cNvGraphicFramePr>
-                  <a:graphic xmlns:a="http://schemas.openxmlformats.org/drawingml/2006/main">
-                    <a:graphicData uri="http://schemas.openxmlformats.org/drawingml/2006/picture">
-                      <pic:pic xmlns:pic="http://schemas.openxmlformats.org/drawingml/2006/picture">
-                        <pic:nvPicPr>
-                          <pic:cNvPr id="0" name="" descr=""/>
-                          <pic:cNvPicPr>
-                            <a:picLocks noChangeAspect="1" noChangeArrowheads="1"/>
-                          </pic:cNvPicPr>
-                        </pic:nvPicPr>
-                        <pic:blipFill>
-                          <a:blip r:embed="rId7" cstate="none"/>
-                          <a:srcRect/>
-                          <a:stretch>
-                            <a:fillRect/>
-                          </a:stretch>
-                        </pic:blipFill>
-                        <pic:spPr bwMode="auto">
-                          <a:xfrm>
-                            <a:off x="0" y="0"/>
-                            <a:ext cx="2413000" cy="2332948"/>
-                          </a:xfrm>
-                          <a:prstGeom prst="rect">
-                            <a:avLst/>
-                          </a:prstGeom>
-                        </pic:spPr>
-                      </pic:pic>
-                    </a:graphicData>
-                  </a:graphic>
-                </wp:inline>
-              </w:drawing>
-            </w:r>
-          </w:p>
-          <w:p>
-            <w:pPr>
-              <w:spacing w:after="20" w:before="60"/>
-            </w:pPr>
-            <w:r>
-              <w:rPr>
-                <w:rFonts w:ascii="Arial" w:cs="Arial" w:eastAsia="Arial" w:hAnsi="Arial"/>
-                <w:b/>
-                <w:bCs/>
-                <w:color w:val="14284B"/>
-                <w:sz w:val="14"/>
-                <w:szCs w:val="14"/>
-              </w:rPr>
-              <w:t xml:space="preserve">Figure 2: </w:t>
-            </w:r>
-            <w:r>
-              <w:rPr>
-                <w:rFonts w:ascii="Arial" w:cs="Arial" w:eastAsia="Arial" w:hAnsi="Arial"/>
-                <w:color w:val="14284B"/>
-                <w:sz w:val="14"/>
-                <w:szCs w:val="14"/>
-              </w:rPr>
-              <w:t xml:space="preserve">Operational risk tornado (value per share, CLP)</w:t>
-            </w:r>
-          </w:p>
-          <w:p>
-            <w:pPr>
-              <w:spacing w:after="0"/>
-              <w:jc w:val="center"/>
-            </w:pPr>
-            <w:r>
-              <w:drawing>
-                <wp:inline distT="0" distB="0" distL="0" distR="0">
-                  <wp:extent cx="2413000" cy="2332948"/>
-                  <wp:effectExtent t="0" r="0" b="0" l="0"/>
-                  <wp:docPr id="1" name="fig2_tornado.png" descr="fig2_tornado.png" title="fig2_tornado.png"/>
-                  <wp:cNvGraphicFramePr>
-                    <a:graphicFrameLocks xmlns:a="http://schemas.openxmlformats.org/drawingml/2006/main" noChangeAspect="1"/>
-                  </wp:cNvGraphicFramePr>
-                  <a:graphic xmlns:a="http://schemas.openxmlformats.org/drawingml/2006/main">
-                    <a:graphicData uri="http://schemas.openxmlformats.org/drawingml/2006/picture">
-                      <pic:pic xmlns:pic="http://schemas.openxmlformats.org/drawingml/2006/picture">
-                        <pic:nvPicPr>
-                          <pic:cNvPr id="0" name="" descr=""/>
-                          <pic:cNvPicPr>
-                            <a:picLocks noChangeAspect="1" noChangeArrowheads="1"/>
-                          </pic:cNvPicPr>
-                        </pic:nvPicPr>
-                        <pic:blipFill>
-                          <a:blip r:embed="rId8" cstate="none"/>
-                          <a:srcRect/>
-                          <a:stretch>
-                            <a:fillRect/>
-                          </a:stretch>
-                        </pic:blipFill>
-                        <pic:spPr bwMode="auto">
-                          <a:xfrm>
-                            <a:off x="0" y="0"/>
-                            <a:ext cx="2413000" cy="2332948"/>
-                          </a:xfrm>
-                          <a:prstGeom prst="rect">
-                            <a:avLst/>
-                          </a:prstGeom>
-                        </pic:spPr>
-                      </pic:pic>
-                    </a:graphicData>
-                  </a:graphic>
-                </wp:inline>
-              </w:drawing>
-            </w:r>
-          </w:p>
-          <w:p>
-            <w:pPr>
-              <w:spacing w:after="20" w:before="60"/>
-            </w:pPr>
-            <w:r>
-              <w:rPr>
-                <w:rFonts w:ascii="Arial" w:cs="Arial" w:eastAsia="Arial" w:hAnsi="Arial"/>
-                <w:b/>
-                <w:bCs/>
-                <w:color w:val="14284B"/>
-                <w:sz w:val="14"/>
-                <w:szCs w:val="14"/>
-              </w:rPr>
-              <w:t xml:space="preserve">Figure 3: </w:t>
-            </w:r>
-            <w:r>
-              <w:rPr>
-                <w:rFonts w:ascii="Arial" w:cs="Arial" w:eastAsia="Arial" w:hAnsi="Arial"/>
-                <w:color w:val="14284B"/>
-                <w:sz w:val="14"/>
-                <w:szCs w:val="14"/>
-              </w:rPr>
-              <w:t xml:space="preserve">Value per share sensitivity: WACC vs g</w:t>
-            </w:r>
-          </w:p>
-          <w:p>
-            <w:pPr>
-              <w:spacing w:after="0"/>
-              <w:jc w:val="center"/>
-            </w:pPr>
-            <w:r>
-              <w:drawing>
-                <wp:inline distT="0" distB="0" distL="0" distR="0">
-                  <wp:extent cx="2413000" cy="1829763"/>
-                  <wp:effectExtent t="0" r="0" b="0" l="0"/>
-                  <wp:docPr id="1" name="fig3_heatmap.png" descr="fig3_heatmap.png" title="fig3_heatmap.png"/>
                   <wp:cNvGraphicFramePr>
                     <a:graphicFrameLocks xmlns:a="http://schemas.openxmlformats.org/drawingml/2006/main" noChangeAspect="1"/>
                   </wp:cNvGraphicFramePr>
@@ -1350,7 +1211,7 @@
                         <pic:spPr bwMode="auto">
                           <a:xfrm>
                             <a:off x="0" y="0"/>
-                            <a:ext cx="2413000" cy="1829763"/>
+                            <a:ext cx="2254250" cy="2331983"/>
                           </a:xfrm>
                           <a:prstGeom prst="rect">
                             <a:avLst/>
@@ -1376,7 +1237,7 @@
                 <w:sz w:val="14"/>
                 <w:szCs w:val="14"/>
               </w:rPr>
-              <w:t xml:space="preserve">Figure 4: </w:t>
+              <w:t xml:space="preserve">Figure 2: </w:t>
             </w:r>
             <w:r>
               <w:rPr>
@@ -1385,7 +1246,7 @@
                 <w:sz w:val="14"/>
                 <w:szCs w:val="14"/>
               </w:rPr>
-              <w:t xml:space="preserve">Earnings sensitivity to a rise in the UF</w:t>
+              <w:t xml:space="preserve">Operational risk tornado (CLP per share)</w:t>
             </w:r>
           </w:p>
           <w:p>
@@ -1396,9 +1257,9 @@
             <w:r>
               <w:drawing>
                 <wp:inline distT="0" distB="0" distL="0" distR="0">
-                  <wp:extent cx="2413000" cy="1601043"/>
+                  <wp:extent cx="2254250" cy="2331983"/>
                   <wp:effectExtent t="0" r="0" b="0" l="0"/>
-                  <wp:docPr id="1" name="fig4_uf.png" descr="fig4_uf.png" title="fig4_uf.png"/>
+                  <wp:docPr id="1" name="fig2_tornado.png" descr="fig2_tornado.png" title="fig2_tornado.png"/>
                   <wp:cNvGraphicFramePr>
                     <a:graphicFrameLocks xmlns:a="http://schemas.openxmlformats.org/drawingml/2006/main" noChangeAspect="1"/>
                   </wp:cNvGraphicFramePr>
@@ -1421,7 +1282,7 @@
                         <pic:spPr bwMode="auto">
                           <a:xfrm>
                             <a:off x="0" y="0"/>
-                            <a:ext cx="2413000" cy="1601043"/>
+                            <a:ext cx="2254250" cy="2331983"/>
                           </a:xfrm>
                           <a:prstGeom prst="rect">
                             <a:avLst/>
@@ -1434,13 +1295,157 @@
               </w:drawing>
             </w:r>
           </w:p>
+          <w:p>
+            <w:pPr>
+              <w:spacing w:after="20" w:before="60"/>
+            </w:pPr>
+            <w:r>
+              <w:rPr>
+                <w:rFonts w:ascii="Arial" w:cs="Arial" w:eastAsia="Arial" w:hAnsi="Arial"/>
+                <w:b/>
+                <w:bCs/>
+                <w:color w:val="14284B"/>
+                <w:sz w:val="14"/>
+                <w:szCs w:val="14"/>
+              </w:rPr>
+              <w:t xml:space="preserve">Figure 3: </w:t>
+            </w:r>
+            <w:r>
+              <w:rPr>
+                <w:rFonts w:ascii="Arial" w:cs="Arial" w:eastAsia="Arial" w:hAnsi="Arial"/>
+                <w:color w:val="14284B"/>
+                <w:sz w:val="14"/>
+                <w:szCs w:val="14"/>
+              </w:rPr>
+              <w:t xml:space="preserve">Value per share sensitivity: WACC vs g</w:t>
+            </w:r>
+          </w:p>
+          <w:p>
+            <w:pPr>
+              <w:spacing w:after="0"/>
+              <w:jc w:val="center"/>
+            </w:pPr>
+            <w:r>
+              <w:drawing>
+                <wp:inline distT="0" distB="0" distL="0" distR="0">
+                  <wp:extent cx="2254250" cy="1783281"/>
+                  <wp:effectExtent t="0" r="0" b="0" l="0"/>
+                  <wp:docPr id="1" name="fig3_heatmap.png" descr="fig3_heatmap.png" title="fig3_heatmap.png"/>
+                  <wp:cNvGraphicFramePr>
+                    <a:graphicFrameLocks xmlns:a="http://schemas.openxmlformats.org/drawingml/2006/main" noChangeAspect="1"/>
+                  </wp:cNvGraphicFramePr>
+                  <a:graphic xmlns:a="http://schemas.openxmlformats.org/drawingml/2006/main">
+                    <a:graphicData uri="http://schemas.openxmlformats.org/drawingml/2006/picture">
+                      <pic:pic xmlns:pic="http://schemas.openxmlformats.org/drawingml/2006/picture">
+                        <pic:nvPicPr>
+                          <pic:cNvPr id="0" name="" descr=""/>
+                          <pic:cNvPicPr>
+                            <a:picLocks noChangeAspect="1" noChangeArrowheads="1"/>
+                          </pic:cNvPicPr>
+                        </pic:nvPicPr>
+                        <pic:blipFill>
+                          <a:blip r:embed="rId11" cstate="none"/>
+                          <a:srcRect/>
+                          <a:stretch>
+                            <a:fillRect/>
+                          </a:stretch>
+                        </pic:blipFill>
+                        <pic:spPr bwMode="auto">
+                          <a:xfrm>
+                            <a:off x="0" y="0"/>
+                            <a:ext cx="2254250" cy="1783281"/>
+                          </a:xfrm>
+                          <a:prstGeom prst="rect">
+                            <a:avLst/>
+                          </a:prstGeom>
+                        </pic:spPr>
+                      </pic:pic>
+                    </a:graphicData>
+                  </a:graphic>
+                </wp:inline>
+              </w:drawing>
+            </w:r>
+          </w:p>
+          <w:p>
+            <w:pPr>
+              <w:spacing w:after="20" w:before="60"/>
+            </w:pPr>
+            <w:r>
+              <w:rPr>
+                <w:rFonts w:ascii="Arial" w:cs="Arial" w:eastAsia="Arial" w:hAnsi="Arial"/>
+                <w:b/>
+                <w:bCs/>
+                <w:color w:val="14284B"/>
+                <w:sz w:val="14"/>
+                <w:szCs w:val="14"/>
+              </w:rPr>
+              <w:t xml:space="preserve">Figure 4: </w:t>
+            </w:r>
+            <w:r>
+              <w:rPr>
+                <w:rFonts w:ascii="Arial" w:cs="Arial" w:eastAsia="Arial" w:hAnsi="Arial"/>
+                <w:color w:val="14284B"/>
+                <w:sz w:val="14"/>
+                <w:szCs w:val="14"/>
+              </w:rPr>
+              <w:t xml:space="preserve">Earnings sensitivity to a rise in the UF</w:t>
+            </w:r>
+          </w:p>
+          <w:p>
+            <w:pPr>
+              <w:spacing w:after="0"/>
+              <w:jc w:val="center"/>
+            </w:pPr>
+            <w:r>
+              <w:drawing>
+                <wp:inline distT="0" distB="0" distL="0" distR="0">
+                  <wp:extent cx="2254250" cy="1554655"/>
+                  <wp:effectExtent t="0" r="0" b="0" l="0"/>
+                  <wp:docPr id="1" name="fig4_uf.png" descr="fig4_uf.png" title="fig4_uf.png"/>
+                  <wp:cNvGraphicFramePr>
+                    <a:graphicFrameLocks xmlns:a="http://schemas.openxmlformats.org/drawingml/2006/main" noChangeAspect="1"/>
+                  </wp:cNvGraphicFramePr>
+                  <a:graphic xmlns:a="http://schemas.openxmlformats.org/drawingml/2006/main">
+                    <a:graphicData uri="http://schemas.openxmlformats.org/drawingml/2006/picture">
+                      <pic:pic xmlns:pic="http://schemas.openxmlformats.org/drawingml/2006/picture">
+                        <pic:nvPicPr>
+                          <pic:cNvPr id="0" name="" descr=""/>
+                          <pic:cNvPicPr>
+                            <a:picLocks noChangeAspect="1" noChangeArrowheads="1"/>
+                          </pic:cNvPicPr>
+                        </pic:nvPicPr>
+                        <pic:blipFill>
+                          <a:blip r:embed="rId12" cstate="none"/>
+                          <a:srcRect/>
+                          <a:stretch>
+                            <a:fillRect/>
+                          </a:stretch>
+                        </pic:blipFill>
+                        <pic:spPr bwMode="auto">
+                          <a:xfrm>
+                            <a:off x="0" y="0"/>
+                            <a:ext cx="2254250" cy="1554655"/>
+                          </a:xfrm>
+                          <a:prstGeom prst="rect">
+                            <a:avLst/>
+                          </a:prstGeom>
+                        </pic:spPr>
+                      </pic:pic>
+                    </a:graphicData>
+                  </a:graphic>
+                </wp:inline>
+              </w:drawing>
+            </w:r>
+          </w:p>
         </w:tc>
       </w:tr>
     </w:tbl>
     <w:sectPr>
-      <w:pgSz w:w="12240" w:h="15840" w:orient="portrait"/>
-      <w:pgMar w:top="620" w:right="620" w:bottom="620" w:left="620" w:header="708" w:footer="708" w:gutter="0"/>
-      <w:pgNumType/>
+      <w:headerReference w:type="default" r:id="rId7"/>
+      <w:footerReference w:type="default" r:id="rId8"/>
+      <w:pgSz w:w="11906" w:h="16838" w:orient="portrait"/>
+      <w:pgMar w:top="1000" w:right="620" w:bottom="900" w:left="620" w:header="450" w:footer="400" w:gutter="0"/>
+      <w:pgNumType w:start="1"/>
       <w:docGrid w:linePitch="360"/>
     </w:sectPr>
   </w:body>
@@ -1488,6 +1493,29 @@
 </w:endnotes>
 </file>
 
+<file path=word/footer1.xml><?xml version="1.0" encoding="utf-8"?>
+<w:ftr xmlns:wpc="http://schemas.microsoft.com/office/word/2010/wordprocessingCanvas" xmlns:mc="http://schemas.openxmlformats.org/markup-compatibility/2006" xmlns:o="urn:schemas-microsoft-com:office:office" xmlns:r="http://schemas.openxmlformats.org/officeDocument/2006/relationships" xmlns:m="http://schemas.openxmlformats.org/officeDocument/2006/math" xmlns:v="urn:schemas-microsoft-com:vml" xmlns:wp14="http://schemas.microsoft.com/office/word/2010/wordprocessingDrawing" xmlns:wp="http://schemas.openxmlformats.org/drawingml/2006/wordprocessingDrawing" xmlns:w10="urn:schemas-microsoft-com:office:word" xmlns:w="http://schemas.openxmlformats.org/wordprocessingml/2006/main" xmlns:w14="http://schemas.microsoft.com/office/word/2010/wordml" xmlns:w15="http://schemas.microsoft.com/office/word/2012/wordml" xmlns:wpg="http://schemas.microsoft.com/office/word/2010/wordprocessingGroup" xmlns:wpi="http://schemas.microsoft.com/office/word/2010/wordprocessingInk" xmlns:wne="http://schemas.microsoft.com/office/word/2006/wordml" xmlns:wps="http://schemas.microsoft.com/office/word/2010/wordprocessingShape">
+  <w:p>
+    <w:pPr>
+      <w:jc w:val="center"/>
+    </w:pPr>
+    <w:r>
+      <w:rPr>
+        <w:rFonts w:ascii="Arial" w:cs="Arial" w:eastAsia="Arial" w:hAnsi="Arial"/>
+        <w:color w:val="5F5F5F"/>
+        <w:sz w:val="14"/>
+        <w:szCs w:val="14"/>
+      </w:rPr>
+      <w:t xml:space="preserve">Page </w:t>
+      <w:fldChar w:fldCharType="begin"/>
+      <w:instrText xml:space="preserve">PAGE</w:instrText>
+      <w:fldChar w:fldCharType="separate"/>
+      <w:fldChar w:fldCharType="end"/>
+    </w:r>
+  </w:p>
+</w:ftr>
+</file>
+
 <file path=word/footnotes.xml><?xml version="1.0" encoding="utf-8"?>
 <w:footnotes xmlns:wpc="http://schemas.microsoft.com/office/word/2010/wordprocessingCanvas" xmlns:mc="http://schemas.openxmlformats.org/markup-compatibility/2006" xmlns:o="urn:schemas-microsoft-com:office:office" xmlns:r="http://schemas.openxmlformats.org/officeDocument/2006/relationships" xmlns:m="http://schemas.openxmlformats.org/officeDocument/2006/math" xmlns:v="urn:schemas-microsoft-com:vml" xmlns:wp14="http://schemas.microsoft.com/office/word/2010/wordprocessingDrawing" xmlns:wp="http://schemas.openxmlformats.org/drawingml/2006/wordprocessingDrawing" xmlns:w10="urn:schemas-microsoft-com:office:word" xmlns:w="http://schemas.openxmlformats.org/wordprocessingml/2006/main" xmlns:w14="http://schemas.microsoft.com/office/word/2010/wordml" xmlns:w15="http://schemas.microsoft.com/office/word/2012/wordml" xmlns:wpg="http://schemas.microsoft.com/office/word/2010/wordprocessingGroup" xmlns:wpi="http://schemas.microsoft.com/office/word/2010/wordprocessingInk" xmlns:wne="http://schemas.microsoft.com/office/word/2006/wordml" xmlns:wps="http://schemas.microsoft.com/office/word/2010/wordprocessingShape" mc:Ignorable="w14 w15 wp14">
   <w:footnote w:type="separator" w:id="-1">
@@ -1523,6 +1551,28 @@
     </w:p>
   </w:footnote>
 </w:footnotes>
+</file>
+
+<file path=word/header1.xml><?xml version="1.0" encoding="utf-8"?>
+<w:hdr xmlns:wpc="http://schemas.microsoft.com/office/word/2010/wordprocessingCanvas" xmlns:mc="http://schemas.openxmlformats.org/markup-compatibility/2006" xmlns:o="urn:schemas-microsoft-com:office:office" xmlns:r="http://schemas.openxmlformats.org/officeDocument/2006/relationships" xmlns:m="http://schemas.openxmlformats.org/officeDocument/2006/math" xmlns:v="urn:schemas-microsoft-com:vml" xmlns:wp14="http://schemas.microsoft.com/office/word/2010/wordprocessingDrawing" xmlns:wp="http://schemas.openxmlformats.org/drawingml/2006/wordprocessingDrawing" xmlns:w10="urn:schemas-microsoft-com:office:word" xmlns:w="http://schemas.openxmlformats.org/wordprocessingml/2006/main" xmlns:w14="http://schemas.microsoft.com/office/word/2010/wordml" xmlns:w15="http://schemas.microsoft.com/office/word/2012/wordml" xmlns:wpg="http://schemas.microsoft.com/office/word/2010/wordprocessingGroup" xmlns:wpi="http://schemas.microsoft.com/office/word/2010/wordprocessingInk" xmlns:wne="http://schemas.microsoft.com/office/word/2006/wordml" xmlns:wps="http://schemas.microsoft.com/office/word/2010/wordprocessingShape" xmlns:cx="http://schemas.microsoft.com/office/drawing/2014/chartex" xmlns:cx1="http://schemas.microsoft.com/office/drawing/2015/9/8/chartex" xmlns:cx2="http://schemas.microsoft.com/office/drawing/2015/10/21/chartex" xmlns:cx3="http://schemas.microsoft.com/office/drawing/2016/5/9/chartex" xmlns:cx4="http://schemas.microsoft.com/office/drawing/2016/5/10/chartex" xmlns:cx5="http://schemas.microsoft.com/office/drawing/2016/5/11/chartex" xmlns:cx6="http://schemas.microsoft.com/office/drawing/2016/5/12/chartex" xmlns:cx7="http://schemas.microsoft.com/office/drawing/2016/5/13/chartex" xmlns:cx8="http://schemas.microsoft.com/office/drawing/2016/5/14/chartex" xmlns:w16cid="http://schemas.microsoft.com/office/word/2016/wordml/cid" xmlns:w16se="http://schemas.microsoft.com/office/word/2015/wordml/symex">
+  <w:p>
+    <w:pPr>
+      <w:pBdr>
+        <w:bottom w:val="single" w:color="D5D9E0" w:sz="4" w:space="2"/>
+      </w:pBdr>
+      <w:jc w:val="right"/>
+    </w:pPr>
+    <w:r>
+      <w:rPr>
+        <w:rFonts w:ascii="Arial" w:cs="Arial" w:eastAsia="Arial" w:hAnsi="Arial"/>
+        <w:color w:val="5F5F5F"/>
+        <w:sz w:val="14"/>
+        <w:szCs w:val="14"/>
+      </w:rPr>
+      <w:t xml:space="preserve">Mallplaza (Plaza S.A.)  |  CFA Institute Research Challenge</w:t>
+    </w:r>
+  </w:p>
+</w:hdr>
 </file>
 
 <file path=word/numbering.xml><?xml version="1.0" encoding="utf-8"?>

</xml_diff>

<commit_message>
Fold Conclusion into other sections and prepare the template for editing
The Conclusion page is split between Industry (now 2.0) and ESG (now 1.5), and its
catalysts point moves to the Investment Summary. Titles and subtitles are real Word
headings, writing areas accept multiple paragraphs, and figure boxes grow with
pasted content.

Co-Authored-By: Claude Opus 5.5 <noreply@anthropic.com>
Claude-Session: https://claude.ai/code/session_0188QZHBkA8n5QL7BtmFakQg
</commit_message>
<xml_diff>
--- a/informe/Investment_Risks_template.docx
+++ b/informe/Investment_Risks_template.docx
@@ -4,6 +4,7 @@
   <w:body>
     <w:p>
       <w:pPr>
+        <w:pStyle w:val="Heading1"/>
         <w:pBdr>
           <w:bottom w:val="single" w:color="14284B" w:sz="18" w:space="2"/>
         </w:pBdr>
@@ -21,23 +22,23 @@
         <w:t xml:space="preserve">INVESTMENT RISKS</w:t>
       </w:r>
     </w:p>
-    <w:p>
-      <w:pPr>
-        <w:shd w:fill="EEF1F6" w:color="auto" w:val="clear"/>
-        <w:spacing w:after="80" w:line="228"/>
-      </w:pPr>
-      <w:sdt>
-        <w:sdtPr>
-          <w:rPr>
-            <w:rFonts w:ascii="Arial" w:hAnsi="Arial" w:cs="Arial"/>
-            <w:color w:val="1A1A1A"/>
-            <w:sz w:val="16"/>
-            <w:szCs w:val="16"/>
-          </w:rPr>
-          <w:id w:val="1000"/>
-          <w:showingPlcHdr/>
-        </w:sdtPr>
-        <w:sdtContent>
+    <w:sdt>
+      <w:sdtPr>
+        <w:rPr>
+          <w:rFonts w:ascii="Arial" w:hAnsi="Arial" w:cs="Arial"/>
+          <w:color w:val="1A1A1A"/>
+          <w:sz w:val="16"/>
+          <w:szCs w:val="16"/>
+        </w:rPr>
+        <w:id w:val="1000"/>
+        <w:showingPlcHdr/>
+      </w:sdtPr>
+      <w:sdtContent>
+        <w:p>
+          <w:pPr>
+            <w:shd w:fill="EEF1F6" w:color="auto" w:val="clear"/>
+            <w:spacing w:after="80" w:line="228"/>
+          </w:pPr>
           <w:r>
             <w:rPr>
               <w:rFonts w:ascii="Arial" w:cs="Arial" w:eastAsia="Arial" w:hAnsi="Arial"/>
@@ -49,9 +50,9 @@
             </w:rPr>
             <w:t xml:space="preserve">[Summary: overall risk view for Mallplaza and the main risks to the recommendation and target price.]</w:t>
           </w:r>
-        </w:sdtContent>
-      </w:sdt>
-    </w:p>
+        </w:p>
+      </w:sdtContent>
+    </w:sdt>
     <w:tbl>
       <w:tblPr>
         <w:tblW w:type="dxa" w:w="10666"/>
@@ -92,6 +93,7 @@
           </w:tcPr>
           <w:p>
             <w:pPr>
+              <w:pStyle w:val="Heading2"/>
               <w:pBdr>
                 <w:bottom w:val="single" w:color="E9004B" w:sz="8" w:space="1"/>
               </w:pBdr>
@@ -109,23 +111,23 @@
               <w:t xml:space="preserve">RISK ASSESSMENT</w:t>
             </w:r>
           </w:p>
-          <w:p>
-            <w:pPr>
-              <w:spacing w:after="40" w:before="0" w:line="228"/>
-              <w:jc w:val="both"/>
-            </w:pPr>
-            <w:sdt>
-              <w:sdtPr>
-                <w:rPr>
-                  <w:rFonts w:ascii="Arial" w:hAnsi="Arial" w:cs="Arial"/>
-                  <w:color w:val="1A1A1A"/>
-                  <w:sz w:val="16"/>
-                  <w:szCs w:val="16"/>
-                </w:rPr>
-                <w:id w:val="1001"/>
-                <w:showingPlcHdr/>
-              </w:sdtPr>
-              <w:sdtContent>
+          <w:sdt>
+            <w:sdtPr>
+              <w:rPr>
+                <w:rFonts w:ascii="Arial" w:hAnsi="Arial" w:cs="Arial"/>
+                <w:color w:val="1A1A1A"/>
+                <w:sz w:val="16"/>
+                <w:szCs w:val="16"/>
+              </w:rPr>
+              <w:id w:val="1001"/>
+              <w:showingPlcHdr/>
+            </w:sdtPr>
+            <w:sdtContent>
+              <w:p>
+                <w:pPr>
+                  <w:spacing w:after="40" w:before="0" w:line="228"/>
+                  <w:jc w:val="both"/>
+                </w:pPr>
                 <w:r>
                   <w:rPr>
                     <w:rFonts w:ascii="Arial" w:cs="Arial" w:eastAsia="Arial" w:hAnsi="Arial"/>
@@ -137,11 +139,12 @@
                   </w:rPr>
                   <w:t xml:space="preserve">[Explain how likelihood and impact were scored (1–5) in Figure 1 and which risks fall in the high-risk zone.]</w:t>
                 </w:r>
-              </w:sdtContent>
-            </w:sdt>
-          </w:p>
-          <w:p>
-            <w:pPr>
+              </w:p>
+            </w:sdtContent>
+          </w:sdt>
+          <w:p>
+            <w:pPr>
+              <w:pStyle w:val="Heading2"/>
               <w:pBdr>
                 <w:bottom w:val="single" w:color="E9004B" w:sz="8" w:space="1"/>
               </w:pBdr>
@@ -524,6 +527,7 @@
           </w:p>
           <w:p>
             <w:pPr>
+              <w:pStyle w:val="Heading2"/>
               <w:pBdr>
                 <w:bottom w:val="single" w:color="E9004B" w:sz="8" w:space="1"/>
               </w:pBdr>
@@ -785,6 +789,7 @@
           </w:p>
           <w:p>
             <w:pPr>
+              <w:pStyle w:val="Heading2"/>
               <w:pBdr>
                 <w:bottom w:val="single" w:color="E9004B" w:sz="8" w:space="1"/>
               </w:pBdr>
@@ -925,6 +930,7 @@
           </w:p>
           <w:p>
             <w:pPr>
+              <w:pStyle w:val="Heading2"/>
               <w:pBdr>
                 <w:bottom w:val="single" w:color="E9004B" w:sz="8" w:space="1"/>
               </w:pBdr>
@@ -1065,6 +1071,7 @@
           </w:p>
           <w:p>
             <w:pPr>
+              <w:pStyle w:val="Heading2"/>
               <w:pBdr>
                 <w:bottom w:val="single" w:color="E9004B" w:sz="8" w:space="1"/>
               </w:pBdr>
@@ -1082,23 +1089,23 @@
               <w:t xml:space="preserve">SENSITIVITY ANALYSIS</w:t>
             </w:r>
           </w:p>
-          <w:p>
-            <w:pPr>
-              <w:spacing w:after="40" w:before="0" w:line="228"/>
-              <w:jc w:val="both"/>
-            </w:pPr>
-            <w:sdt>
-              <w:sdtPr>
-                <w:rPr>
-                  <w:rFonts w:ascii="Arial" w:hAnsi="Arial" w:cs="Arial"/>
-                  <w:color w:val="1A1A1A"/>
-                  <w:sz w:val="16"/>
-                  <w:szCs w:val="16"/>
-                </w:rPr>
-                <w:id w:val="1023"/>
-                <w:showingPlcHdr/>
-              </w:sdtPr>
-              <w:sdtContent>
+          <w:sdt>
+            <w:sdtPr>
+              <w:rPr>
+                <w:rFonts w:ascii="Arial" w:hAnsi="Arial" w:cs="Arial"/>
+                <w:color w:val="1A1A1A"/>
+                <w:sz w:val="16"/>
+                <w:szCs w:val="16"/>
+              </w:rPr>
+              <w:id w:val="1023"/>
+              <w:showingPlcHdr/>
+            </w:sdtPr>
+            <w:sdtContent>
+              <w:p>
+                <w:pPr>
+                  <w:spacing w:after="40" w:before="0" w:line="228"/>
+                  <w:jc w:val="both"/>
+                </w:pPr>
                 <w:r>
                   <w:rPr>
                     <w:rFonts w:ascii="Arial" w:cs="Arial" w:eastAsia="Arial" w:hAnsi="Arial"/>
@@ -1110,9 +1117,9 @@
                   </w:rPr>
                   <w:t xml:space="preserve">[Comment on Figures 2–4: which drivers move the value per share most, the downside versus the base case, and whether the recommendation holds.]</w:t>
                 </w:r>
-              </w:sdtContent>
-            </w:sdt>
-          </w:p>
+              </w:p>
+            </w:sdtContent>
+          </w:sdt>
         </w:tc>
         <w:tc>
           <w:tcPr>
@@ -1676,6 +1683,7 @@
     <w:rPrDefault>
       <w:rPr>
         <w:rFonts w:ascii="Arial" w:cs="Arial" w:eastAsia="Arial" w:hAnsi="Arial"/>
+        <w:color w:val="1A1A1A"/>
         <w:sz w:val="16"/>
         <w:szCs w:val="16"/>
       </w:rPr>
@@ -1697,10 +1705,16 @@
     <w:basedOn w:val="Normal"/>
     <w:next w:val="Normal"/>
     <w:qFormat/>
+    <w:pPr>
+      <w:keepNext/>
+    </w:pPr>
     <w:rPr>
-      <w:color w:val="2E74B5"/>
-      <w:sz w:val="32"/>
-      <w:szCs w:val="32"/>
+      <w:rFonts w:ascii="Arial" w:cs="Arial" w:eastAsia="Arial" w:hAnsi="Arial"/>
+      <w:b/>
+      <w:bCs/>
+      <w:color w:val="14284B"/>
+      <w:sz w:val="30"/>
+      <w:szCs w:val="30"/>
     </w:rPr>
   </w:style>
   <w:style w:type="paragraph" w:styleId="Heading2">
@@ -1708,10 +1722,16 @@
     <w:basedOn w:val="Normal"/>
     <w:next w:val="Normal"/>
     <w:qFormat/>
+    <w:pPr>
+      <w:keepNext/>
+    </w:pPr>
     <w:rPr>
-      <w:color w:val="2E74B5"/>
-      <w:sz w:val="26"/>
-      <w:szCs w:val="26"/>
+      <w:rFonts w:ascii="Arial" w:cs="Arial" w:eastAsia="Arial" w:hAnsi="Arial"/>
+      <w:b/>
+      <w:bCs/>
+      <w:color w:val="14284B"/>
+      <w:sz w:val="16"/>
+      <w:szCs w:val="16"/>
     </w:rPr>
   </w:style>
   <w:style w:type="paragraph" w:styleId="Heading3">

</xml_diff>